<commit_message>
Bảng Word: độ rộng cột theo nội dung (cột ngắn vừa đủ, cột nhiều chữ chia phần còn lại)
Sửa lỗi cột STT bị nhận nhầm là cột để trống nên bị nới rộng.

Co-Authored-By: Claude Opus 5.5 <noreply@anthropic.com>
Claude-Session: https://claude.ai/code/session_01EYfrLZFALxho7iwpK7bTVa
</commit_message>
<xml_diff>
--- a/word/01-xac-dinh-cap-do/phieu-xac-dinh-cap-do.docx
+++ b/word/01-xac-dinh-cap-do/phieu-xac-dinh-cap-do.docx
@@ -36,9 +36,9 @@
         <w:tblLayout w:type="autofit"/>
       </w:tblPr>
       <w:tblGrid>
-        <w:gridCol w:w="2813"/>
-        <w:gridCol w:w="4620"/>
-        <w:gridCol w:w="1592"/>
+        <w:gridCol w:w="2195"/>
+        <w:gridCol w:w="5147"/>
+        <w:gridCol w:w="1683"/>
       </w:tblGrid>
       <w:tr>
         <w:trPr>
@@ -47,7 +47,7 @@
         </w:trPr>
         <w:tc>
           <w:tcPr>
-            <w:tcW w:type="dxa" w:w="2813"/>
+            <w:tcW w:type="dxa" w:w="2195"/>
             <w:tcBorders>
               <w:top w:val="single" w:color="000000" w:sz="4"/>
               <w:left w:val="single" w:color="000000" w:sz="4"/>
@@ -84,7 +84,7 @@
         </w:tc>
         <w:tc>
           <w:tcPr>
-            <w:tcW w:type="dxa" w:w="4620"/>
+            <w:tcW w:type="dxa" w:w="5147"/>
             <w:tcBorders>
               <w:top w:val="single" w:color="000000" w:sz="4"/>
               <w:left w:val="single" w:color="000000" w:sz="4"/>
@@ -121,7 +121,7 @@
         </w:tc>
         <w:tc>
           <w:tcPr>
-            <w:tcW w:type="dxa" w:w="1592"/>
+            <w:tcW w:type="dxa" w:w="1683"/>
             <w:tcBorders>
               <w:top w:val="single" w:color="000000" w:sz="4"/>
               <w:left w:val="single" w:color="000000" w:sz="4"/>
@@ -164,7 +164,7 @@
         </w:trPr>
         <w:tc>
           <w:tcPr>
-            <w:tcW w:type="dxa" w:w="2813"/>
+            <w:tcW w:type="dxa" w:w="2195"/>
             <w:tcBorders>
               <w:top w:val="single" w:color="000000" w:sz="4"/>
               <w:left w:val="single" w:color="000000" w:sz="4"/>
@@ -200,7 +200,7 @@
         </w:tc>
         <w:tc>
           <w:tcPr>
-            <w:tcW w:type="dxa" w:w="4620"/>
+            <w:tcW w:type="dxa" w:w="5147"/>
             <w:tcBorders>
               <w:top w:val="single" w:color="000000" w:sz="4"/>
               <w:left w:val="single" w:color="000000" w:sz="4"/>
@@ -237,7 +237,7 @@
         </w:tc>
         <w:tc>
           <w:tcPr>
-            <w:tcW w:type="dxa" w:w="1592"/>
+            <w:tcW w:type="dxa" w:w="1683"/>
             <w:tcBorders>
               <w:top w:val="single" w:color="000000" w:sz="4"/>
               <w:left w:val="single" w:color="000000" w:sz="4"/>
@@ -279,7 +279,7 @@
         </w:trPr>
         <w:tc>
           <w:tcPr>
-            <w:tcW w:type="dxa" w:w="2813"/>
+            <w:tcW w:type="dxa" w:w="2195"/>
             <w:tcBorders>
               <w:top w:val="single" w:color="000000" w:sz="4"/>
               <w:left w:val="single" w:color="000000" w:sz="4"/>
@@ -315,7 +315,7 @@
         </w:tc>
         <w:tc>
           <w:tcPr>
-            <w:tcW w:type="dxa" w:w="4620"/>
+            <w:tcW w:type="dxa" w:w="5147"/>
             <w:tcBorders>
               <w:top w:val="single" w:color="000000" w:sz="4"/>
               <w:left w:val="single" w:color="000000" w:sz="4"/>
@@ -352,7 +352,7 @@
         </w:tc>
         <w:tc>
           <w:tcPr>
-            <w:tcW w:type="dxa" w:w="1592"/>
+            <w:tcW w:type="dxa" w:w="1683"/>
             <w:tcBorders>
               <w:top w:val="single" w:color="000000" w:sz="4"/>
               <w:left w:val="single" w:color="000000" w:sz="4"/>
@@ -394,7 +394,7 @@
         </w:trPr>
         <w:tc>
           <w:tcPr>
-            <w:tcW w:type="dxa" w:w="2813"/>
+            <w:tcW w:type="dxa" w:w="2195"/>
             <w:tcBorders>
               <w:top w:val="single" w:color="000000" w:sz="4"/>
               <w:left w:val="single" w:color="000000" w:sz="4"/>
@@ -430,7 +430,7 @@
         </w:tc>
         <w:tc>
           <w:tcPr>
-            <w:tcW w:type="dxa" w:w="4620"/>
+            <w:tcW w:type="dxa" w:w="5147"/>
             <w:tcBorders>
               <w:top w:val="single" w:color="000000" w:sz="4"/>
               <w:left w:val="single" w:color="000000" w:sz="4"/>
@@ -492,7 +492,7 @@
         </w:tc>
         <w:tc>
           <w:tcPr>
-            <w:tcW w:type="dxa" w:w="1592"/>
+            <w:tcW w:type="dxa" w:w="1683"/>
             <w:tcBorders>
               <w:top w:val="single" w:color="000000" w:sz="4"/>
               <w:left w:val="single" w:color="000000" w:sz="4"/>
@@ -534,7 +534,7 @@
         </w:trPr>
         <w:tc>
           <w:tcPr>
-            <w:tcW w:type="dxa" w:w="2813"/>
+            <w:tcW w:type="dxa" w:w="2195"/>
             <w:tcBorders>
               <w:top w:val="single" w:color="000000" w:sz="4"/>
               <w:left w:val="single" w:color="000000" w:sz="4"/>
@@ -570,7 +570,7 @@
         </w:tc>
         <w:tc>
           <w:tcPr>
-            <w:tcW w:type="dxa" w:w="4620"/>
+            <w:tcW w:type="dxa" w:w="5147"/>
             <w:tcBorders>
               <w:top w:val="single" w:color="000000" w:sz="4"/>
               <w:left w:val="single" w:color="000000" w:sz="4"/>
@@ -644,7 +644,7 @@
         </w:tc>
         <w:tc>
           <w:tcPr>
-            <w:tcW w:type="dxa" w:w="1592"/>
+            <w:tcW w:type="dxa" w:w="1683"/>
             <w:tcBorders>
               <w:top w:val="single" w:color="000000" w:sz="4"/>
               <w:left w:val="single" w:color="000000" w:sz="4"/>
@@ -686,7 +686,7 @@
         </w:trPr>
         <w:tc>
           <w:tcPr>
-            <w:tcW w:type="dxa" w:w="2813"/>
+            <w:tcW w:type="dxa" w:w="2195"/>
             <w:tcBorders>
               <w:top w:val="single" w:color="000000" w:sz="4"/>
               <w:left w:val="single" w:color="000000" w:sz="4"/>
@@ -722,7 +722,7 @@
         </w:tc>
         <w:tc>
           <w:tcPr>
-            <w:tcW w:type="dxa" w:w="4620"/>
+            <w:tcW w:type="dxa" w:w="5147"/>
             <w:tcBorders>
               <w:top w:val="single" w:color="000000" w:sz="4"/>
               <w:left w:val="single" w:color="000000" w:sz="4"/>
@@ -759,7 +759,7 @@
         </w:tc>
         <w:tc>
           <w:tcPr>
-            <w:tcW w:type="dxa" w:w="1592"/>
+            <w:tcW w:type="dxa" w:w="1683"/>
             <w:tcBorders>
               <w:top w:val="single" w:color="000000" w:sz="4"/>
               <w:left w:val="single" w:color="000000" w:sz="4"/>
@@ -801,7 +801,7 @@
         </w:trPr>
         <w:tc>
           <w:tcPr>
-            <w:tcW w:type="dxa" w:w="2813"/>
+            <w:tcW w:type="dxa" w:w="2195"/>
             <w:tcBorders>
               <w:top w:val="single" w:color="000000" w:sz="4"/>
               <w:left w:val="single" w:color="000000" w:sz="4"/>
@@ -837,7 +837,7 @@
         </w:tc>
         <w:tc>
           <w:tcPr>
-            <w:tcW w:type="dxa" w:w="4620"/>
+            <w:tcW w:type="dxa" w:w="5147"/>
             <w:tcBorders>
               <w:top w:val="single" w:color="000000" w:sz="4"/>
               <w:left w:val="single" w:color="000000" w:sz="4"/>
@@ -874,7 +874,7 @@
         </w:tc>
         <w:tc>
           <w:tcPr>
-            <w:tcW w:type="dxa" w:w="1592"/>
+            <w:tcW w:type="dxa" w:w="1683"/>
             <w:tcBorders>
               <w:top w:val="single" w:color="000000" w:sz="4"/>
               <w:left w:val="single" w:color="000000" w:sz="4"/>
@@ -916,7 +916,7 @@
         </w:trPr>
         <w:tc>
           <w:tcPr>
-            <w:tcW w:type="dxa" w:w="2813"/>
+            <w:tcW w:type="dxa" w:w="2195"/>
             <w:tcBorders>
               <w:top w:val="single" w:color="000000" w:sz="4"/>
               <w:left w:val="single" w:color="000000" w:sz="4"/>
@@ -952,7 +952,7 @@
         </w:tc>
         <w:tc>
           <w:tcPr>
-            <w:tcW w:type="dxa" w:w="4620"/>
+            <w:tcW w:type="dxa" w:w="5147"/>
             <w:tcBorders>
               <w:top w:val="single" w:color="000000" w:sz="4"/>
               <w:left w:val="single" w:color="000000" w:sz="4"/>
@@ -1038,7 +1038,7 @@
         </w:tc>
         <w:tc>
           <w:tcPr>
-            <w:tcW w:type="dxa" w:w="1592"/>
+            <w:tcW w:type="dxa" w:w="1683"/>
             <w:tcBorders>
               <w:top w:val="single" w:color="000000" w:sz="4"/>
               <w:left w:val="single" w:color="000000" w:sz="4"/>
@@ -1080,7 +1080,7 @@
         </w:trPr>
         <w:tc>
           <w:tcPr>
-            <w:tcW w:type="dxa" w:w="2813"/>
+            <w:tcW w:type="dxa" w:w="2195"/>
             <w:tcBorders>
               <w:top w:val="single" w:color="000000" w:sz="4"/>
               <w:left w:val="single" w:color="000000" w:sz="4"/>
@@ -1116,7 +1116,7 @@
         </w:tc>
         <w:tc>
           <w:tcPr>
-            <w:tcW w:type="dxa" w:w="4620"/>
+            <w:tcW w:type="dxa" w:w="5147"/>
             <w:tcBorders>
               <w:top w:val="single" w:color="000000" w:sz="4"/>
               <w:left w:val="single" w:color="000000" w:sz="4"/>
@@ -1153,7 +1153,7 @@
         </w:tc>
         <w:tc>
           <w:tcPr>
-            <w:tcW w:type="dxa" w:w="1592"/>
+            <w:tcW w:type="dxa" w:w="1683"/>
             <w:tcBorders>
               <w:top w:val="single" w:color="000000" w:sz="4"/>
               <w:left w:val="single" w:color="000000" w:sz="4"/>
@@ -1195,7 +1195,7 @@
         </w:trPr>
         <w:tc>
           <w:tcPr>
-            <w:tcW w:type="dxa" w:w="2813"/>
+            <w:tcW w:type="dxa" w:w="2195"/>
             <w:tcBorders>
               <w:top w:val="single" w:color="000000" w:sz="4"/>
               <w:left w:val="single" w:color="000000" w:sz="4"/>
@@ -1231,7 +1231,7 @@
         </w:tc>
         <w:tc>
           <w:tcPr>
-            <w:tcW w:type="dxa" w:w="4620"/>
+            <w:tcW w:type="dxa" w:w="5147"/>
             <w:tcBorders>
               <w:top w:val="single" w:color="000000" w:sz="4"/>
               <w:left w:val="single" w:color="000000" w:sz="4"/>
@@ -1267,7 +1267,7 @@
         </w:tc>
         <w:tc>
           <w:tcPr>
-            <w:tcW w:type="dxa" w:w="1592"/>
+            <w:tcW w:type="dxa" w:w="1683"/>
             <w:tcBorders>
               <w:top w:val="single" w:color="000000" w:sz="4"/>
               <w:left w:val="single" w:color="000000" w:sz="4"/>
@@ -1309,7 +1309,7 @@
         </w:trPr>
         <w:tc>
           <w:tcPr>
-            <w:tcW w:type="dxa" w:w="2813"/>
+            <w:tcW w:type="dxa" w:w="2195"/>
             <w:tcBorders>
               <w:top w:val="single" w:color="000000" w:sz="4"/>
               <w:left w:val="single" w:color="000000" w:sz="4"/>
@@ -1345,7 +1345,7 @@
         </w:tc>
         <w:tc>
           <w:tcPr>
-            <w:tcW w:type="dxa" w:w="4620"/>
+            <w:tcW w:type="dxa" w:w="5147"/>
             <w:tcBorders>
               <w:top w:val="single" w:color="000000" w:sz="4"/>
               <w:left w:val="single" w:color="000000" w:sz="4"/>
@@ -1444,7 +1444,7 @@
         </w:tc>
         <w:tc>
           <w:tcPr>
-            <w:tcW w:type="dxa" w:w="1592"/>
+            <w:tcW w:type="dxa" w:w="1683"/>
             <w:tcBorders>
               <w:top w:val="single" w:color="000000" w:sz="4"/>
               <w:left w:val="single" w:color="000000" w:sz="4"/>
@@ -1486,7 +1486,7 @@
         </w:trPr>
         <w:tc>
           <w:tcPr>
-            <w:tcW w:type="dxa" w:w="2813"/>
+            <w:tcW w:type="dxa" w:w="2195"/>
             <w:tcBorders>
               <w:top w:val="single" w:color="000000" w:sz="4"/>
               <w:left w:val="single" w:color="000000" w:sz="4"/>
@@ -1522,7 +1522,7 @@
         </w:tc>
         <w:tc>
           <w:tcPr>
-            <w:tcW w:type="dxa" w:w="4620"/>
+            <w:tcW w:type="dxa" w:w="5147"/>
             <w:tcBorders>
               <w:top w:val="single" w:color="000000" w:sz="4"/>
               <w:left w:val="single" w:color="000000" w:sz="4"/>
@@ -1559,7 +1559,7 @@
         </w:tc>
         <w:tc>
           <w:tcPr>
-            <w:tcW w:type="dxa" w:w="1592"/>
+            <w:tcW w:type="dxa" w:w="1683"/>
             <w:tcBorders>
               <w:top w:val="single" w:color="000000" w:sz="4"/>
               <w:left w:val="single" w:color="000000" w:sz="4"/>
@@ -1601,7 +1601,7 @@
         </w:trPr>
         <w:tc>
           <w:tcPr>
-            <w:tcW w:type="dxa" w:w="2813"/>
+            <w:tcW w:type="dxa" w:w="2195"/>
             <w:tcBorders>
               <w:top w:val="single" w:color="000000" w:sz="4"/>
               <w:left w:val="single" w:color="000000" w:sz="4"/>
@@ -1637,7 +1637,7 @@
         </w:tc>
         <w:tc>
           <w:tcPr>
-            <w:tcW w:type="dxa" w:w="4620"/>
+            <w:tcW w:type="dxa" w:w="5147"/>
             <w:tcBorders>
               <w:top w:val="single" w:color="000000" w:sz="4"/>
               <w:left w:val="single" w:color="000000" w:sz="4"/>
@@ -1673,7 +1673,7 @@
         </w:tc>
         <w:tc>
           <w:tcPr>
-            <w:tcW w:type="dxa" w:w="1592"/>
+            <w:tcW w:type="dxa" w:w="1683"/>
             <w:tcBorders>
               <w:top w:val="single" w:color="000000" w:sz="4"/>
               <w:left w:val="single" w:color="000000" w:sz="4"/>
@@ -1715,7 +1715,7 @@
         </w:trPr>
         <w:tc>
           <w:tcPr>
-            <w:tcW w:type="dxa" w:w="2813"/>
+            <w:tcW w:type="dxa" w:w="2195"/>
             <w:tcBorders>
               <w:top w:val="single" w:color="000000" w:sz="4"/>
               <w:left w:val="single" w:color="000000" w:sz="4"/>
@@ -1751,7 +1751,7 @@
         </w:tc>
         <w:tc>
           <w:tcPr>
-            <w:tcW w:type="dxa" w:w="4620"/>
+            <w:tcW w:type="dxa" w:w="5147"/>
             <w:tcBorders>
               <w:top w:val="single" w:color="000000" w:sz="4"/>
               <w:left w:val="single" w:color="000000" w:sz="4"/>
@@ -1837,7 +1837,7 @@
         </w:tc>
         <w:tc>
           <w:tcPr>
-            <w:tcW w:type="dxa" w:w="1592"/>
+            <w:tcW w:type="dxa" w:w="1683"/>
             <w:tcBorders>
               <w:top w:val="single" w:color="000000" w:sz="4"/>
               <w:left w:val="single" w:color="000000" w:sz="4"/>
@@ -2065,9 +2065,9 @@
         <w:tblLayout w:type="autofit"/>
       </w:tblPr>
       <w:tblGrid>
-        <w:gridCol w:w="3613"/>
-        <w:gridCol w:w="1558"/>
-        <w:gridCol w:w="3854"/>
+        <w:gridCol w:w="2306"/>
+        <w:gridCol w:w="2161"/>
+        <w:gridCol w:w="4558"/>
       </w:tblGrid>
       <w:tr>
         <w:trPr>
@@ -2076,7 +2076,7 @@
         </w:trPr>
         <w:tc>
           <w:tcPr>
-            <w:tcW w:type="dxa" w:w="3613"/>
+            <w:tcW w:type="dxa" w:w="2306"/>
             <w:tcBorders>
               <w:top w:val="single" w:color="000000" w:sz="4"/>
               <w:left w:val="single" w:color="000000" w:sz="4"/>
@@ -2113,7 +2113,7 @@
         </w:tc>
         <w:tc>
           <w:tcPr>
-            <w:tcW w:type="dxa" w:w="1558"/>
+            <w:tcW w:type="dxa" w:w="2161"/>
             <w:tcBorders>
               <w:top w:val="single" w:color="000000" w:sz="4"/>
               <w:left w:val="single" w:color="000000" w:sz="4"/>
@@ -2150,7 +2150,7 @@
         </w:tc>
         <w:tc>
           <w:tcPr>
-            <w:tcW w:type="dxa" w:w="3854"/>
+            <w:tcW w:type="dxa" w:w="4558"/>
             <w:tcBorders>
               <w:top w:val="single" w:color="000000" w:sz="4"/>
               <w:left w:val="single" w:color="000000" w:sz="4"/>
@@ -2193,7 +2193,7 @@
         </w:trPr>
         <w:tc>
           <w:tcPr>
-            <w:tcW w:type="dxa" w:w="3613"/>
+            <w:tcW w:type="dxa" w:w="2306"/>
             <w:tcBorders>
               <w:top w:val="single" w:color="000000" w:sz="4"/>
               <w:left w:val="single" w:color="000000" w:sz="4"/>
@@ -2230,7 +2230,7 @@
         </w:tc>
         <w:tc>
           <w:tcPr>
-            <w:tcW w:type="dxa" w:w="1558"/>
+            <w:tcW w:type="dxa" w:w="2161"/>
             <w:tcBorders>
               <w:top w:val="single" w:color="000000" w:sz="4"/>
               <w:left w:val="single" w:color="000000" w:sz="4"/>
@@ -2267,7 +2267,7 @@
         </w:tc>
         <w:tc>
           <w:tcPr>
-            <w:tcW w:type="dxa" w:w="3854"/>
+            <w:tcW w:type="dxa" w:w="4558"/>
             <w:tcBorders>
               <w:top w:val="single" w:color="000000" w:sz="4"/>
               <w:left w:val="single" w:color="000000" w:sz="4"/>
@@ -2309,7 +2309,7 @@
         </w:trPr>
         <w:tc>
           <w:tcPr>
-            <w:tcW w:type="dxa" w:w="3613"/>
+            <w:tcW w:type="dxa" w:w="2306"/>
             <w:tcBorders>
               <w:top w:val="single" w:color="000000" w:sz="4"/>
               <w:left w:val="single" w:color="000000" w:sz="4"/>
@@ -2346,31 +2346,31 @@
         </w:tc>
         <w:tc>
           <w:tcPr>
-            <w:tcW w:type="dxa" w:w="1558"/>
-            <w:tcBorders>
-              <w:top w:val="single" w:color="000000" w:sz="4"/>
-              <w:left w:val="single" w:color="000000" w:sz="4"/>
-              <w:bottom w:val="single" w:color="000000" w:sz="4"/>
-              <w:right w:val="single" w:color="000000" w:sz="4"/>
-            </w:tcBorders>
-            <w:tcMar>
-              <w:top w:type="dxa" w:w="30"/>
-              <w:left w:type="dxa" w:w="70"/>
-              <w:bottom w:type="dxa" w:w="30"/>
-              <w:right w:type="dxa" w:w="70"/>
-            </w:tcMar>
-            <w:vAlign w:val="center"/>
-          </w:tcPr>
-          <w:p>
-            <w:pPr>
-              <w:spacing w:after="0" w:before="0" w:line="240" w:lineRule="auto"/>
-              <w:jc w:val="left"/>
-            </w:pPr>
-          </w:p>
-        </w:tc>
-        <w:tc>
-          <w:tcPr>
-            <w:tcW w:type="dxa" w:w="3854"/>
+            <w:tcW w:type="dxa" w:w="2161"/>
+            <w:tcBorders>
+              <w:top w:val="single" w:color="000000" w:sz="4"/>
+              <w:left w:val="single" w:color="000000" w:sz="4"/>
+              <w:bottom w:val="single" w:color="000000" w:sz="4"/>
+              <w:right w:val="single" w:color="000000" w:sz="4"/>
+            </w:tcBorders>
+            <w:tcMar>
+              <w:top w:type="dxa" w:w="30"/>
+              <w:left w:type="dxa" w:w="70"/>
+              <w:bottom w:type="dxa" w:w="30"/>
+              <w:right w:type="dxa" w:w="70"/>
+            </w:tcMar>
+            <w:vAlign w:val="center"/>
+          </w:tcPr>
+          <w:p>
+            <w:pPr>
+              <w:spacing w:after="0" w:before="0" w:line="240" w:lineRule="auto"/>
+              <w:jc w:val="left"/>
+            </w:pPr>
+          </w:p>
+        </w:tc>
+        <w:tc>
+          <w:tcPr>
+            <w:tcW w:type="dxa" w:w="4558"/>
             <w:tcBorders>
               <w:top w:val="single" w:color="000000" w:sz="4"/>
               <w:left w:val="single" w:color="000000" w:sz="4"/>
@@ -2445,10 +2445,10 @@
         <w:tblLayout w:type="autofit"/>
       </w:tblPr>
       <w:tblGrid>
-        <w:gridCol w:w="3094"/>
-        <w:gridCol w:w="2265"/>
-        <w:gridCol w:w="1332"/>
-        <w:gridCol w:w="2334"/>
+        <w:gridCol w:w="5403"/>
+        <w:gridCol w:w="1081"/>
+        <w:gridCol w:w="1081"/>
+        <w:gridCol w:w="1460"/>
       </w:tblGrid>
       <w:tr>
         <w:trPr>
@@ -2457,7 +2457,7 @@
         </w:trPr>
         <w:tc>
           <w:tcPr>
-            <w:tcW w:type="dxa" w:w="3094"/>
+            <w:tcW w:type="dxa" w:w="5403"/>
             <w:tcBorders>
               <w:top w:val="single" w:color="000000" w:sz="4"/>
               <w:left w:val="single" w:color="000000" w:sz="4"/>
@@ -2494,7 +2494,7 @@
         </w:tc>
         <w:tc>
           <w:tcPr>
-            <w:tcW w:type="dxa" w:w="2265"/>
+            <w:tcW w:type="dxa" w:w="1081"/>
             <w:tcBorders>
               <w:top w:val="single" w:color="000000" w:sz="4"/>
               <w:left w:val="single" w:color="000000" w:sz="4"/>
@@ -2531,7 +2531,7 @@
         </w:tc>
         <w:tc>
           <w:tcPr>
-            <w:tcW w:type="dxa" w:w="1332"/>
+            <w:tcW w:type="dxa" w:w="1081"/>
             <w:tcBorders>
               <w:top w:val="single" w:color="000000" w:sz="4"/>
               <w:left w:val="single" w:color="000000" w:sz="4"/>
@@ -2568,7 +2568,7 @@
         </w:tc>
         <w:tc>
           <w:tcPr>
-            <w:tcW w:type="dxa" w:w="2334"/>
+            <w:tcW w:type="dxa" w:w="1460"/>
             <w:tcBorders>
               <w:top w:val="single" w:color="000000" w:sz="4"/>
               <w:left w:val="single" w:color="000000" w:sz="4"/>
@@ -2611,7 +2611,7 @@
         </w:trPr>
         <w:tc>
           <w:tcPr>
-            <w:tcW w:type="dxa" w:w="3094"/>
+            <w:tcW w:type="dxa" w:w="5403"/>
             <w:tcBorders>
               <w:top w:val="single" w:color="000000" w:sz="4"/>
               <w:left w:val="single" w:color="000000" w:sz="4"/>
@@ -2648,55 +2648,55 @@
         </w:tc>
         <w:tc>
           <w:tcPr>
-            <w:tcW w:type="dxa" w:w="2265"/>
-            <w:tcBorders>
-              <w:top w:val="single" w:color="000000" w:sz="4"/>
-              <w:left w:val="single" w:color="000000" w:sz="4"/>
-              <w:bottom w:val="single" w:color="000000" w:sz="4"/>
-              <w:right w:val="single" w:color="000000" w:sz="4"/>
-            </w:tcBorders>
-            <w:tcMar>
-              <w:top w:type="dxa" w:w="30"/>
-              <w:left w:type="dxa" w:w="70"/>
-              <w:bottom w:type="dxa" w:w="30"/>
-              <w:right w:type="dxa" w:w="70"/>
-            </w:tcMar>
-            <w:vAlign w:val="center"/>
-          </w:tcPr>
-          <w:p>
-            <w:pPr>
-              <w:spacing w:after="0" w:before="0" w:line="240" w:lineRule="auto"/>
-              <w:jc w:val="left"/>
-            </w:pPr>
-          </w:p>
-        </w:tc>
-        <w:tc>
-          <w:tcPr>
-            <w:tcW w:type="dxa" w:w="1332"/>
-            <w:tcBorders>
-              <w:top w:val="single" w:color="000000" w:sz="4"/>
-              <w:left w:val="single" w:color="000000" w:sz="4"/>
-              <w:bottom w:val="single" w:color="000000" w:sz="4"/>
-              <w:right w:val="single" w:color="000000" w:sz="4"/>
-            </w:tcBorders>
-            <w:tcMar>
-              <w:top w:type="dxa" w:w="30"/>
-              <w:left w:type="dxa" w:w="70"/>
-              <w:bottom w:type="dxa" w:w="30"/>
-              <w:right w:type="dxa" w:w="70"/>
-            </w:tcMar>
-            <w:vAlign w:val="center"/>
-          </w:tcPr>
-          <w:p>
-            <w:pPr>
-              <w:spacing w:after="0" w:before="0" w:line="240" w:lineRule="auto"/>
-              <w:jc w:val="left"/>
-            </w:pPr>
-          </w:p>
-        </w:tc>
-        <w:tc>
-          <w:tcPr>
-            <w:tcW w:type="dxa" w:w="2334"/>
+            <w:tcW w:type="dxa" w:w="1081"/>
+            <w:tcBorders>
+              <w:top w:val="single" w:color="000000" w:sz="4"/>
+              <w:left w:val="single" w:color="000000" w:sz="4"/>
+              <w:bottom w:val="single" w:color="000000" w:sz="4"/>
+              <w:right w:val="single" w:color="000000" w:sz="4"/>
+            </w:tcBorders>
+            <w:tcMar>
+              <w:top w:type="dxa" w:w="30"/>
+              <w:left w:type="dxa" w:w="70"/>
+              <w:bottom w:type="dxa" w:w="30"/>
+              <w:right w:type="dxa" w:w="70"/>
+            </w:tcMar>
+            <w:vAlign w:val="center"/>
+          </w:tcPr>
+          <w:p>
+            <w:pPr>
+              <w:spacing w:after="0" w:before="0" w:line="240" w:lineRule="auto"/>
+              <w:jc w:val="left"/>
+            </w:pPr>
+          </w:p>
+        </w:tc>
+        <w:tc>
+          <w:tcPr>
+            <w:tcW w:type="dxa" w:w="1081"/>
+            <w:tcBorders>
+              <w:top w:val="single" w:color="000000" w:sz="4"/>
+              <w:left w:val="single" w:color="000000" w:sz="4"/>
+              <w:bottom w:val="single" w:color="000000" w:sz="4"/>
+              <w:right w:val="single" w:color="000000" w:sz="4"/>
+            </w:tcBorders>
+            <w:tcMar>
+              <w:top w:type="dxa" w:w="30"/>
+              <w:left w:type="dxa" w:w="70"/>
+              <w:bottom w:type="dxa" w:w="30"/>
+              <w:right w:type="dxa" w:w="70"/>
+            </w:tcMar>
+            <w:vAlign w:val="center"/>
+          </w:tcPr>
+          <w:p>
+            <w:pPr>
+              <w:spacing w:after="0" w:before="0" w:line="240" w:lineRule="auto"/>
+              <w:jc w:val="left"/>
+            </w:pPr>
+          </w:p>
+        </w:tc>
+        <w:tc>
+          <w:tcPr>
+            <w:tcW w:type="dxa" w:w="1460"/>
             <w:tcBorders>
               <w:top w:val="single" w:color="000000" w:sz="4"/>
               <w:left w:val="single" w:color="000000" w:sz="4"/>
@@ -2804,9 +2804,9 @@
         <w:tblLayout w:type="autofit"/>
       </w:tblPr>
       <w:tblGrid>
-        <w:gridCol w:w="3987"/>
-        <w:gridCol w:w="1943"/>
-        <w:gridCol w:w="3095"/>
+        <w:gridCol w:w="4212"/>
+        <w:gridCol w:w="715"/>
+        <w:gridCol w:w="4098"/>
       </w:tblGrid>
       <w:tr>
         <w:trPr>
@@ -2815,7 +2815,7 @@
         </w:trPr>
         <w:tc>
           <w:tcPr>
-            <w:tcW w:type="dxa" w:w="3987"/>
+            <w:tcW w:type="dxa" w:w="4212"/>
             <w:tcBorders>
               <w:top w:val="single" w:color="000000" w:sz="4"/>
               <w:left w:val="single" w:color="000000" w:sz="4"/>
@@ -2852,7 +2852,7 @@
         </w:tc>
         <w:tc>
           <w:tcPr>
-            <w:tcW w:type="dxa" w:w="1943"/>
+            <w:tcW w:type="dxa" w:w="715"/>
             <w:tcBorders>
               <w:top w:val="single" w:color="000000" w:sz="4"/>
               <w:left w:val="single" w:color="000000" w:sz="4"/>
@@ -2889,7 +2889,7 @@
         </w:tc>
         <w:tc>
           <w:tcPr>
-            <w:tcW w:type="dxa" w:w="3095"/>
+            <w:tcW w:type="dxa" w:w="4098"/>
             <w:tcBorders>
               <w:top w:val="single" w:color="000000" w:sz="4"/>
               <w:left w:val="single" w:color="000000" w:sz="4"/>
@@ -2932,7 +2932,7 @@
         </w:trPr>
         <w:tc>
           <w:tcPr>
-            <w:tcW w:type="dxa" w:w="3987"/>
+            <w:tcW w:type="dxa" w:w="4212"/>
             <w:tcBorders>
               <w:top w:val="single" w:color="000000" w:sz="4"/>
               <w:left w:val="single" w:color="000000" w:sz="4"/>
@@ -2968,7 +2968,7 @@
         </w:tc>
         <w:tc>
           <w:tcPr>
-            <w:tcW w:type="dxa" w:w="1943"/>
+            <w:tcW w:type="dxa" w:w="715"/>
             <w:tcBorders>
               <w:top w:val="single" w:color="000000" w:sz="4"/>
               <w:left w:val="single" w:color="000000" w:sz="4"/>
@@ -3004,7 +3004,7 @@
         </w:tc>
         <w:tc>
           <w:tcPr>
-            <w:tcW w:type="dxa" w:w="3095"/>
+            <w:tcW w:type="dxa" w:w="4098"/>
             <w:tcBorders>
               <w:top w:val="single" w:color="000000" w:sz="4"/>
               <w:left w:val="single" w:color="000000" w:sz="4"/>
@@ -3034,7 +3034,7 @@
         </w:trPr>
         <w:tc>
           <w:tcPr>
-            <w:tcW w:type="dxa" w:w="3987"/>
+            <w:tcW w:type="dxa" w:w="4212"/>
             <w:tcBorders>
               <w:top w:val="single" w:color="000000" w:sz="4"/>
               <w:left w:val="single" w:color="000000" w:sz="4"/>
@@ -3070,7 +3070,7 @@
         </w:tc>
         <w:tc>
           <w:tcPr>
-            <w:tcW w:type="dxa" w:w="1943"/>
+            <w:tcW w:type="dxa" w:w="715"/>
             <w:tcBorders>
               <w:top w:val="single" w:color="000000" w:sz="4"/>
               <w:left w:val="single" w:color="000000" w:sz="4"/>
@@ -3106,7 +3106,7 @@
         </w:tc>
         <w:tc>
           <w:tcPr>
-            <w:tcW w:type="dxa" w:w="3095"/>
+            <w:tcW w:type="dxa" w:w="4098"/>
             <w:tcBorders>
               <w:top w:val="single" w:color="000000" w:sz="4"/>
               <w:left w:val="single" w:color="000000" w:sz="4"/>
@@ -3136,7 +3136,7 @@
         </w:trPr>
         <w:tc>
           <w:tcPr>
-            <w:tcW w:type="dxa" w:w="3987"/>
+            <w:tcW w:type="dxa" w:w="4212"/>
             <w:tcBorders>
               <w:top w:val="single" w:color="000000" w:sz="4"/>
               <w:left w:val="single" w:color="000000" w:sz="4"/>
@@ -3172,7 +3172,7 @@
         </w:tc>
         <w:tc>
           <w:tcPr>
-            <w:tcW w:type="dxa" w:w="1943"/>
+            <w:tcW w:type="dxa" w:w="715"/>
             <w:tcBorders>
               <w:top w:val="single" w:color="000000" w:sz="4"/>
               <w:left w:val="single" w:color="000000" w:sz="4"/>
@@ -3208,7 +3208,7 @@
         </w:tc>
         <w:tc>
           <w:tcPr>
-            <w:tcW w:type="dxa" w:w="3095"/>
+            <w:tcW w:type="dxa" w:w="4098"/>
             <w:tcBorders>
               <w:top w:val="single" w:color="000000" w:sz="4"/>
               <w:left w:val="single" w:color="000000" w:sz="4"/>
@@ -3238,7 +3238,7 @@
         </w:trPr>
         <w:tc>
           <w:tcPr>
-            <w:tcW w:type="dxa" w:w="3987"/>
+            <w:tcW w:type="dxa" w:w="4212"/>
             <w:tcBorders>
               <w:top w:val="single" w:color="000000" w:sz="4"/>
               <w:left w:val="single" w:color="000000" w:sz="4"/>
@@ -3274,7 +3274,7 @@
         </w:tc>
         <w:tc>
           <w:tcPr>
-            <w:tcW w:type="dxa" w:w="1943"/>
+            <w:tcW w:type="dxa" w:w="715"/>
             <w:tcBorders>
               <w:top w:val="single" w:color="000000" w:sz="4"/>
               <w:left w:val="single" w:color="000000" w:sz="4"/>
@@ -3310,7 +3310,7 @@
         </w:tc>
         <w:tc>
           <w:tcPr>
-            <w:tcW w:type="dxa" w:w="3095"/>
+            <w:tcW w:type="dxa" w:w="4098"/>
             <w:tcBorders>
               <w:top w:val="single" w:color="000000" w:sz="4"/>
               <w:left w:val="single" w:color="000000" w:sz="4"/>
@@ -3386,9 +3386,9 @@
         <w:tblLayout w:type="autofit"/>
       </w:tblPr>
       <w:tblGrid>
-        <w:gridCol w:w="3905"/>
-        <w:gridCol w:w="1214"/>
-        <w:gridCol w:w="3906"/>
+        <w:gridCol w:w="3415"/>
+        <w:gridCol w:w="887"/>
+        <w:gridCol w:w="4723"/>
       </w:tblGrid>
       <w:tr>
         <w:trPr>
@@ -3397,7 +3397,7 @@
         </w:trPr>
         <w:tc>
           <w:tcPr>
-            <w:tcW w:type="dxa" w:w="3905"/>
+            <w:tcW w:type="dxa" w:w="3415"/>
             <w:tcBorders>
               <w:top w:val="single" w:color="000000" w:sz="4"/>
               <w:left w:val="single" w:color="000000" w:sz="4"/>
@@ -3434,7 +3434,7 @@
         </w:tc>
         <w:tc>
           <w:tcPr>
-            <w:tcW w:type="dxa" w:w="1214"/>
+            <w:tcW w:type="dxa" w:w="887"/>
             <w:tcBorders>
               <w:top w:val="single" w:color="000000" w:sz="4"/>
               <w:left w:val="single" w:color="000000" w:sz="4"/>
@@ -3471,7 +3471,7 @@
         </w:tc>
         <w:tc>
           <w:tcPr>
-            <w:tcW w:type="dxa" w:w="3906"/>
+            <w:tcW w:type="dxa" w:w="4723"/>
             <w:tcBorders>
               <w:top w:val="single" w:color="000000" w:sz="4"/>
               <w:left w:val="single" w:color="000000" w:sz="4"/>
@@ -3514,7 +3514,7 @@
         </w:trPr>
         <w:tc>
           <w:tcPr>
-            <w:tcW w:type="dxa" w:w="3905"/>
+            <w:tcW w:type="dxa" w:w="3415"/>
             <w:tcBorders>
               <w:top w:val="single" w:color="000000" w:sz="4"/>
               <w:left w:val="single" w:color="000000" w:sz="4"/>
@@ -3550,7 +3550,7 @@
         </w:tc>
         <w:tc>
           <w:tcPr>
-            <w:tcW w:type="dxa" w:w="1214"/>
+            <w:tcW w:type="dxa" w:w="887"/>
             <w:tcBorders>
               <w:top w:val="single" w:color="000000" w:sz="4"/>
               <w:left w:val="single" w:color="000000" w:sz="4"/>
@@ -3586,7 +3586,7 @@
         </w:tc>
         <w:tc>
           <w:tcPr>
-            <w:tcW w:type="dxa" w:w="3906"/>
+            <w:tcW w:type="dxa" w:w="4723"/>
             <w:tcBorders>
               <w:top w:val="single" w:color="000000" w:sz="4"/>
               <w:left w:val="single" w:color="000000" w:sz="4"/>
@@ -3616,7 +3616,7 @@
         </w:trPr>
         <w:tc>
           <w:tcPr>
-            <w:tcW w:type="dxa" w:w="3905"/>
+            <w:tcW w:type="dxa" w:w="3415"/>
             <w:tcBorders>
               <w:top w:val="single" w:color="000000" w:sz="4"/>
               <w:left w:val="single" w:color="000000" w:sz="4"/>
@@ -3652,7 +3652,7 @@
         </w:tc>
         <w:tc>
           <w:tcPr>
-            <w:tcW w:type="dxa" w:w="1214"/>
+            <w:tcW w:type="dxa" w:w="887"/>
             <w:tcBorders>
               <w:top w:val="single" w:color="000000" w:sz="4"/>
               <w:left w:val="single" w:color="000000" w:sz="4"/>
@@ -3688,7 +3688,7 @@
         </w:tc>
         <w:tc>
           <w:tcPr>
-            <w:tcW w:type="dxa" w:w="3906"/>
+            <w:tcW w:type="dxa" w:w="4723"/>
             <w:tcBorders>
               <w:top w:val="single" w:color="000000" w:sz="4"/>
               <w:left w:val="single" w:color="000000" w:sz="4"/>
@@ -3755,7 +3755,7 @@
         </w:trPr>
         <w:tc>
           <w:tcPr>
-            <w:tcW w:type="dxa" w:w="3905"/>
+            <w:tcW w:type="dxa" w:w="3415"/>
             <w:tcBorders>
               <w:top w:val="single" w:color="000000" w:sz="4"/>
               <w:left w:val="single" w:color="000000" w:sz="4"/>
@@ -3791,7 +3791,7 @@
         </w:tc>
         <w:tc>
           <w:tcPr>
-            <w:tcW w:type="dxa" w:w="1214"/>
+            <w:tcW w:type="dxa" w:w="887"/>
             <w:tcBorders>
               <w:top w:val="single" w:color="000000" w:sz="4"/>
               <w:left w:val="single" w:color="000000" w:sz="4"/>
@@ -3827,7 +3827,7 @@
         </w:tc>
         <w:tc>
           <w:tcPr>
-            <w:tcW w:type="dxa" w:w="3906"/>
+            <w:tcW w:type="dxa" w:w="4723"/>
             <w:tcBorders>
               <w:top w:val="single" w:color="000000" w:sz="4"/>
               <w:left w:val="single" w:color="000000" w:sz="4"/>
@@ -3869,7 +3869,7 @@
         </w:trPr>
         <w:tc>
           <w:tcPr>
-            <w:tcW w:type="dxa" w:w="3905"/>
+            <w:tcW w:type="dxa" w:w="3415"/>
             <w:tcBorders>
               <w:top w:val="single" w:color="000000" w:sz="4"/>
               <w:left w:val="single" w:color="000000" w:sz="4"/>
@@ -3905,7 +3905,7 @@
         </w:tc>
         <w:tc>
           <w:tcPr>
-            <w:tcW w:type="dxa" w:w="1214"/>
+            <w:tcW w:type="dxa" w:w="887"/>
             <w:tcBorders>
               <w:top w:val="single" w:color="000000" w:sz="4"/>
               <w:left w:val="single" w:color="000000" w:sz="4"/>
@@ -3941,7 +3941,7 @@
         </w:tc>
         <w:tc>
           <w:tcPr>
-            <w:tcW w:type="dxa" w:w="3906"/>
+            <w:tcW w:type="dxa" w:w="4723"/>
             <w:tcBorders>
               <w:top w:val="single" w:color="000000" w:sz="4"/>
               <w:left w:val="single" w:color="000000" w:sz="4"/>
@@ -3996,7 +3996,7 @@
         </w:trPr>
         <w:tc>
           <w:tcPr>
-            <w:tcW w:type="dxa" w:w="3905"/>
+            <w:tcW w:type="dxa" w:w="3415"/>
             <w:tcBorders>
               <w:top w:val="single" w:color="000000" w:sz="4"/>
               <w:left w:val="single" w:color="000000" w:sz="4"/>
@@ -4032,7 +4032,7 @@
         </w:tc>
         <w:tc>
           <w:tcPr>
-            <w:tcW w:type="dxa" w:w="1214"/>
+            <w:tcW w:type="dxa" w:w="887"/>
             <w:tcBorders>
               <w:top w:val="single" w:color="000000" w:sz="4"/>
               <w:left w:val="single" w:color="000000" w:sz="4"/>
@@ -4068,7 +4068,7 @@
         </w:tc>
         <w:tc>
           <w:tcPr>
-            <w:tcW w:type="dxa" w:w="3906"/>
+            <w:tcW w:type="dxa" w:w="4723"/>
             <w:tcBorders>
               <w:top w:val="single" w:color="000000" w:sz="4"/>
               <w:left w:val="single" w:color="000000" w:sz="4"/>
@@ -4098,7 +4098,7 @@
         </w:trPr>
         <w:tc>
           <w:tcPr>
-            <w:tcW w:type="dxa" w:w="3905"/>
+            <w:tcW w:type="dxa" w:w="3415"/>
             <w:tcBorders>
               <w:top w:val="single" w:color="000000" w:sz="4"/>
               <w:left w:val="single" w:color="000000" w:sz="4"/>
@@ -4134,7 +4134,7 @@
         </w:tc>
         <w:tc>
           <w:tcPr>
-            <w:tcW w:type="dxa" w:w="1214"/>
+            <w:tcW w:type="dxa" w:w="887"/>
             <w:tcBorders>
               <w:top w:val="single" w:color="000000" w:sz="4"/>
               <w:left w:val="single" w:color="000000" w:sz="4"/>
@@ -4170,7 +4170,7 @@
         </w:tc>
         <w:tc>
           <w:tcPr>
-            <w:tcW w:type="dxa" w:w="3906"/>
+            <w:tcW w:type="dxa" w:w="4723"/>
             <w:tcBorders>
               <w:top w:val="single" w:color="000000" w:sz="4"/>
               <w:left w:val="single" w:color="000000" w:sz="4"/>
@@ -4259,10 +4259,10 @@
         <w:tblLayout w:type="autofit"/>
       </w:tblPr>
       <w:tblGrid>
-        <w:gridCol w:w="2668"/>
-        <w:gridCol w:w="2976"/>
-        <w:gridCol w:w="2433"/>
-        <w:gridCol w:w="948"/>
+        <w:gridCol w:w="2669"/>
+        <w:gridCol w:w="3213"/>
+        <w:gridCol w:w="2155"/>
+        <w:gridCol w:w="988"/>
       </w:tblGrid>
       <w:tr>
         <w:trPr>
@@ -4271,7 +4271,7 @@
         </w:trPr>
         <w:tc>
           <w:tcPr>
-            <w:tcW w:type="dxa" w:w="2668"/>
+            <w:tcW w:type="dxa" w:w="2669"/>
             <w:tcBorders>
               <w:top w:val="single" w:color="000000" w:sz="4"/>
               <w:left w:val="single" w:color="000000" w:sz="4"/>
@@ -4308,7 +4308,7 @@
         </w:tc>
         <w:tc>
           <w:tcPr>
-            <w:tcW w:type="dxa" w:w="2976"/>
+            <w:tcW w:type="dxa" w:w="3213"/>
             <w:tcBorders>
               <w:top w:val="single" w:color="000000" w:sz="4"/>
               <w:left w:val="single" w:color="000000" w:sz="4"/>
@@ -4345,7 +4345,7 @@
         </w:tc>
         <w:tc>
           <w:tcPr>
-            <w:tcW w:type="dxa" w:w="2433"/>
+            <w:tcW w:type="dxa" w:w="2155"/>
             <w:tcBorders>
               <w:top w:val="single" w:color="000000" w:sz="4"/>
               <w:left w:val="single" w:color="000000" w:sz="4"/>
@@ -4382,7 +4382,7 @@
         </w:tc>
         <w:tc>
           <w:tcPr>
-            <w:tcW w:type="dxa" w:w="948"/>
+            <w:tcW w:type="dxa" w:w="988"/>
             <w:tcBorders>
               <w:top w:val="single" w:color="000000" w:sz="4"/>
               <w:left w:val="single" w:color="000000" w:sz="4"/>
@@ -4425,7 +4425,7 @@
         </w:trPr>
         <w:tc>
           <w:tcPr>
-            <w:tcW w:type="dxa" w:w="2668"/>
+            <w:tcW w:type="dxa" w:w="2669"/>
             <w:tcBorders>
               <w:top w:val="single" w:color="000000" w:sz="4"/>
               <w:left w:val="single" w:color="000000" w:sz="4"/>
@@ -4485,7 +4485,7 @@
         </w:tc>
         <w:tc>
           <w:tcPr>
-            <w:tcW w:type="dxa" w:w="2976"/>
+            <w:tcW w:type="dxa" w:w="3213"/>
             <w:tcBorders>
               <w:top w:val="single" w:color="000000" w:sz="4"/>
               <w:left w:val="single" w:color="000000" w:sz="4"/>
@@ -4522,31 +4522,31 @@
         </w:tc>
         <w:tc>
           <w:tcPr>
-            <w:tcW w:type="dxa" w:w="2433"/>
-            <w:tcBorders>
-              <w:top w:val="single" w:color="000000" w:sz="4"/>
-              <w:left w:val="single" w:color="000000" w:sz="4"/>
-              <w:bottom w:val="single" w:color="000000" w:sz="4"/>
-              <w:right w:val="single" w:color="000000" w:sz="4"/>
-            </w:tcBorders>
-            <w:tcMar>
-              <w:top w:type="dxa" w:w="30"/>
-              <w:left w:type="dxa" w:w="70"/>
-              <w:bottom w:type="dxa" w:w="30"/>
-              <w:right w:type="dxa" w:w="70"/>
-            </w:tcMar>
-            <w:vAlign w:val="center"/>
-          </w:tcPr>
-          <w:p>
-            <w:pPr>
-              <w:spacing w:after="0" w:before="0" w:line="240" w:lineRule="auto"/>
-              <w:jc w:val="left"/>
-            </w:pPr>
-          </w:p>
-        </w:tc>
-        <w:tc>
-          <w:tcPr>
-            <w:tcW w:type="dxa" w:w="948"/>
+            <w:tcW w:type="dxa" w:w="2155"/>
+            <w:tcBorders>
+              <w:top w:val="single" w:color="000000" w:sz="4"/>
+              <w:left w:val="single" w:color="000000" w:sz="4"/>
+              <w:bottom w:val="single" w:color="000000" w:sz="4"/>
+              <w:right w:val="single" w:color="000000" w:sz="4"/>
+            </w:tcBorders>
+            <w:tcMar>
+              <w:top w:type="dxa" w:w="30"/>
+              <w:left w:type="dxa" w:w="70"/>
+              <w:bottom w:type="dxa" w:w="30"/>
+              <w:right w:type="dxa" w:w="70"/>
+            </w:tcMar>
+            <w:vAlign w:val="center"/>
+          </w:tcPr>
+          <w:p>
+            <w:pPr>
+              <w:spacing w:after="0" w:before="0" w:line="240" w:lineRule="auto"/>
+              <w:jc w:val="left"/>
+            </w:pPr>
+          </w:p>
+        </w:tc>
+        <w:tc>
+          <w:tcPr>
+            <w:tcW w:type="dxa" w:w="988"/>
             <w:tcBorders>
               <w:top w:val="single" w:color="000000" w:sz="4"/>
               <w:left w:val="single" w:color="000000" w:sz="4"/>
@@ -4576,7 +4576,7 @@
         </w:trPr>
         <w:tc>
           <w:tcPr>
-            <w:tcW w:type="dxa" w:w="2668"/>
+            <w:tcW w:type="dxa" w:w="2669"/>
             <w:tcBorders>
               <w:top w:val="single" w:color="000000" w:sz="4"/>
               <w:left w:val="single" w:color="000000" w:sz="4"/>
@@ -4636,7 +4636,7 @@
         </w:tc>
         <w:tc>
           <w:tcPr>
-            <w:tcW w:type="dxa" w:w="2976"/>
+            <w:tcW w:type="dxa" w:w="3213"/>
             <w:tcBorders>
               <w:top w:val="single" w:color="000000" w:sz="4"/>
               <w:left w:val="single" w:color="000000" w:sz="4"/>
@@ -4673,7 +4673,7 @@
         </w:tc>
         <w:tc>
           <w:tcPr>
-            <w:tcW w:type="dxa" w:w="2433"/>
+            <w:tcW w:type="dxa" w:w="2155"/>
             <w:tcBorders>
               <w:top w:val="single" w:color="000000" w:sz="4"/>
               <w:left w:val="single" w:color="000000" w:sz="4"/>
@@ -4709,7 +4709,7 @@
         </w:tc>
         <w:tc>
           <w:tcPr>
-            <w:tcW w:type="dxa" w:w="948"/>
+            <w:tcW w:type="dxa" w:w="988"/>
             <w:tcBorders>
               <w:top w:val="single" w:color="000000" w:sz="4"/>
               <w:left w:val="single" w:color="000000" w:sz="4"/>
@@ -4739,7 +4739,7 @@
         </w:trPr>
         <w:tc>
           <w:tcPr>
-            <w:tcW w:type="dxa" w:w="2668"/>
+            <w:tcW w:type="dxa" w:w="2669"/>
             <w:tcBorders>
               <w:top w:val="single" w:color="000000" w:sz="4"/>
               <w:left w:val="single" w:color="000000" w:sz="4"/>
@@ -4775,7 +4775,7 @@
         </w:tc>
         <w:tc>
           <w:tcPr>
-            <w:tcW w:type="dxa" w:w="2976"/>
+            <w:tcW w:type="dxa" w:w="3213"/>
             <w:tcBorders>
               <w:top w:val="single" w:color="000000" w:sz="4"/>
               <w:left w:val="single" w:color="000000" w:sz="4"/>
@@ -4811,7 +4811,7 @@
         </w:tc>
         <w:tc>
           <w:tcPr>
-            <w:tcW w:type="dxa" w:w="2433"/>
+            <w:tcW w:type="dxa" w:w="2155"/>
             <w:tcBorders>
               <w:top w:val="single" w:color="000000" w:sz="4"/>
               <w:left w:val="single" w:color="000000" w:sz="4"/>
@@ -4847,7 +4847,7 @@
         </w:tc>
         <w:tc>
           <w:tcPr>
-            <w:tcW w:type="dxa" w:w="948"/>
+            <w:tcW w:type="dxa" w:w="988"/>
             <w:tcBorders>
               <w:top w:val="single" w:color="000000" w:sz="4"/>
               <w:left w:val="single" w:color="000000" w:sz="4"/>
@@ -4877,7 +4877,7 @@
         </w:trPr>
         <w:tc>
           <w:tcPr>
-            <w:tcW w:type="dxa" w:w="2668"/>
+            <w:tcW w:type="dxa" w:w="2669"/>
             <w:tcBorders>
               <w:top w:val="single" w:color="000000" w:sz="4"/>
               <w:left w:val="single" w:color="000000" w:sz="4"/>
@@ -4913,7 +4913,7 @@
         </w:tc>
         <w:tc>
           <w:tcPr>
-            <w:tcW w:type="dxa" w:w="2976"/>
+            <w:tcW w:type="dxa" w:w="3213"/>
             <w:tcBorders>
               <w:top w:val="single" w:color="000000" w:sz="4"/>
               <w:left w:val="single" w:color="000000" w:sz="4"/>
@@ -4949,31 +4949,31 @@
         </w:tc>
         <w:tc>
           <w:tcPr>
-            <w:tcW w:type="dxa" w:w="2433"/>
-            <w:tcBorders>
-              <w:top w:val="single" w:color="000000" w:sz="4"/>
-              <w:left w:val="single" w:color="000000" w:sz="4"/>
-              <w:bottom w:val="single" w:color="000000" w:sz="4"/>
-              <w:right w:val="single" w:color="000000" w:sz="4"/>
-            </w:tcBorders>
-            <w:tcMar>
-              <w:top w:type="dxa" w:w="30"/>
-              <w:left w:type="dxa" w:w="70"/>
-              <w:bottom w:type="dxa" w:w="30"/>
-              <w:right w:type="dxa" w:w="70"/>
-            </w:tcMar>
-            <w:vAlign w:val="center"/>
-          </w:tcPr>
-          <w:p>
-            <w:pPr>
-              <w:spacing w:after="0" w:before="0" w:line="240" w:lineRule="auto"/>
-              <w:jc w:val="left"/>
-            </w:pPr>
-          </w:p>
-        </w:tc>
-        <w:tc>
-          <w:tcPr>
-            <w:tcW w:type="dxa" w:w="948"/>
+            <w:tcW w:type="dxa" w:w="2155"/>
+            <w:tcBorders>
+              <w:top w:val="single" w:color="000000" w:sz="4"/>
+              <w:left w:val="single" w:color="000000" w:sz="4"/>
+              <w:bottom w:val="single" w:color="000000" w:sz="4"/>
+              <w:right w:val="single" w:color="000000" w:sz="4"/>
+            </w:tcBorders>
+            <w:tcMar>
+              <w:top w:type="dxa" w:w="30"/>
+              <w:left w:type="dxa" w:w="70"/>
+              <w:bottom w:type="dxa" w:w="30"/>
+              <w:right w:type="dxa" w:w="70"/>
+            </w:tcMar>
+            <w:vAlign w:val="center"/>
+          </w:tcPr>
+          <w:p>
+            <w:pPr>
+              <w:spacing w:after="0" w:before="0" w:line="240" w:lineRule="auto"/>
+              <w:jc w:val="left"/>
+            </w:pPr>
+          </w:p>
+        </w:tc>
+        <w:tc>
+          <w:tcPr>
+            <w:tcW w:type="dxa" w:w="988"/>
             <w:tcBorders>
               <w:top w:val="single" w:color="000000" w:sz="4"/>
               <w:left w:val="single" w:color="000000" w:sz="4"/>
@@ -5056,8 +5056,8 @@
         <w:tblLayout w:type="autofit"/>
       </w:tblPr>
       <w:tblGrid>
-        <w:gridCol w:w="4512"/>
-        <w:gridCol w:w="4513"/>
+        <w:gridCol w:w="4308"/>
+        <w:gridCol w:w="4717"/>
       </w:tblGrid>
       <w:tr>
         <w:trPr>
@@ -5066,7 +5066,7 @@
         </w:trPr>
         <w:tc>
           <w:tcPr>
-            <w:tcW w:type="dxa" w:w="4512"/>
+            <w:tcW w:type="dxa" w:w="4308"/>
             <w:tcBorders>
               <w:top w:val="single" w:color="000000" w:sz="4"/>
               <w:left w:val="single" w:color="000000" w:sz="4"/>
@@ -5103,7 +5103,7 @@
         </w:tc>
         <w:tc>
           <w:tcPr>
-            <w:tcW w:type="dxa" w:w="4513"/>
+            <w:tcW w:type="dxa" w:w="4717"/>
             <w:tcBorders>
               <w:top w:val="single" w:color="000000" w:sz="4"/>
               <w:left w:val="single" w:color="000000" w:sz="4"/>
@@ -5146,7 +5146,7 @@
         </w:trPr>
         <w:tc>
           <w:tcPr>
-            <w:tcW w:type="dxa" w:w="4512"/>
+            <w:tcW w:type="dxa" w:w="4308"/>
             <w:tcBorders>
               <w:top w:val="single" w:color="000000" w:sz="4"/>
               <w:left w:val="single" w:color="000000" w:sz="4"/>
@@ -5182,7 +5182,7 @@
         </w:tc>
         <w:tc>
           <w:tcPr>
-            <w:tcW w:type="dxa" w:w="4513"/>
+            <w:tcW w:type="dxa" w:w="4717"/>
             <w:tcBorders>
               <w:top w:val="single" w:color="000000" w:sz="4"/>
               <w:left w:val="single" w:color="000000" w:sz="4"/>
@@ -5225,7 +5225,7 @@
         </w:trPr>
         <w:tc>
           <w:tcPr>
-            <w:tcW w:type="dxa" w:w="4512"/>
+            <w:tcW w:type="dxa" w:w="4308"/>
             <w:tcBorders>
               <w:top w:val="single" w:color="000000" w:sz="4"/>
               <w:left w:val="single" w:color="000000" w:sz="4"/>
@@ -5261,7 +5261,7 @@
         </w:tc>
         <w:tc>
           <w:tcPr>
-            <w:tcW w:type="dxa" w:w="4513"/>
+            <w:tcW w:type="dxa" w:w="4717"/>
             <w:tcBorders>
               <w:top w:val="single" w:color="000000" w:sz="4"/>
               <w:left w:val="single" w:color="000000" w:sz="4"/>
@@ -5304,7 +5304,7 @@
         </w:trPr>
         <w:tc>
           <w:tcPr>
-            <w:tcW w:type="dxa" w:w="4512"/>
+            <w:tcW w:type="dxa" w:w="4308"/>
             <w:tcBorders>
               <w:top w:val="single" w:color="000000" w:sz="4"/>
               <w:left w:val="single" w:color="000000" w:sz="4"/>
@@ -5340,7 +5340,7 @@
         </w:tc>
         <w:tc>
           <w:tcPr>
-            <w:tcW w:type="dxa" w:w="4513"/>
+            <w:tcW w:type="dxa" w:w="4717"/>
             <w:tcBorders>
               <w:top w:val="single" w:color="000000" w:sz="4"/>
               <w:left w:val="single" w:color="000000" w:sz="4"/>
@@ -5407,7 +5407,7 @@
         </w:trPr>
         <w:tc>
           <w:tcPr>
-            <w:tcW w:type="dxa" w:w="4512"/>
+            <w:tcW w:type="dxa" w:w="4308"/>
             <w:tcBorders>
               <w:top w:val="single" w:color="000000" w:sz="4"/>
               <w:left w:val="single" w:color="000000" w:sz="4"/>
@@ -5443,7 +5443,7 @@
         </w:tc>
         <w:tc>
           <w:tcPr>
-            <w:tcW w:type="dxa" w:w="4513"/>
+            <w:tcW w:type="dxa" w:w="4717"/>
             <w:tcBorders>
               <w:top w:val="single" w:color="000000" w:sz="4"/>
               <w:left w:val="single" w:color="000000" w:sz="4"/>
@@ -5510,7 +5510,7 @@
         </w:trPr>
         <w:tc>
           <w:tcPr>
-            <w:tcW w:type="dxa" w:w="4512"/>
+            <w:tcW w:type="dxa" w:w="4308"/>
             <w:tcBorders>
               <w:top w:val="single" w:color="000000" w:sz="4"/>
               <w:left w:val="single" w:color="000000" w:sz="4"/>
@@ -5546,7 +5546,7 @@
         </w:tc>
         <w:tc>
           <w:tcPr>
-            <w:tcW w:type="dxa" w:w="4513"/>
+            <w:tcW w:type="dxa" w:w="4717"/>
             <w:tcBorders>
               <w:top w:val="single" w:color="000000" w:sz="4"/>
               <w:left w:val="single" w:color="000000" w:sz="4"/>
@@ -5623,12 +5623,12 @@
         <w:tblLayout w:type="autofit"/>
       </w:tblPr>
       <w:tblGrid>
-        <w:gridCol w:w="1895"/>
-        <w:gridCol w:w="1126"/>
-        <w:gridCol w:w="1548"/>
-        <w:gridCol w:w="1370"/>
-        <w:gridCol w:w="1181"/>
-        <w:gridCol w:w="1905"/>
+        <w:gridCol w:w="2537"/>
+        <w:gridCol w:w="772"/>
+        <w:gridCol w:w="2255"/>
+        <w:gridCol w:w="1773"/>
+        <w:gridCol w:w="772"/>
+        <w:gridCol w:w="916"/>
       </w:tblGrid>
       <w:tr>
         <w:trPr>
@@ -5637,7 +5637,7 @@
         </w:trPr>
         <w:tc>
           <w:tcPr>
-            <w:tcW w:type="dxa" w:w="1895"/>
+            <w:tcW w:type="dxa" w:w="2537"/>
             <w:tcBorders>
               <w:top w:val="single" w:color="000000" w:sz="4"/>
               <w:left w:val="single" w:color="000000" w:sz="4"/>
@@ -5674,7 +5674,7 @@
         </w:tc>
         <w:tc>
           <w:tcPr>
-            <w:tcW w:type="dxa" w:w="1126"/>
+            <w:tcW w:type="dxa" w:w="772"/>
             <w:tcBorders>
               <w:top w:val="single" w:color="000000" w:sz="4"/>
               <w:left w:val="single" w:color="000000" w:sz="4"/>
@@ -5711,7 +5711,7 @@
         </w:tc>
         <w:tc>
           <w:tcPr>
-            <w:tcW w:type="dxa" w:w="1548"/>
+            <w:tcW w:type="dxa" w:w="2255"/>
             <w:tcBorders>
               <w:top w:val="single" w:color="000000" w:sz="4"/>
               <w:left w:val="single" w:color="000000" w:sz="4"/>
@@ -5748,7 +5748,7 @@
         </w:tc>
         <w:tc>
           <w:tcPr>
-            <w:tcW w:type="dxa" w:w="1370"/>
+            <w:tcW w:type="dxa" w:w="1773"/>
             <w:tcBorders>
               <w:top w:val="single" w:color="000000" w:sz="4"/>
               <w:left w:val="single" w:color="000000" w:sz="4"/>
@@ -5785,7 +5785,7 @@
         </w:tc>
         <w:tc>
           <w:tcPr>
-            <w:tcW w:type="dxa" w:w="1181"/>
+            <w:tcW w:type="dxa" w:w="772"/>
             <w:tcBorders>
               <w:top w:val="single" w:color="000000" w:sz="4"/>
               <w:left w:val="single" w:color="000000" w:sz="4"/>
@@ -5822,7 +5822,7 @@
         </w:tc>
         <w:tc>
           <w:tcPr>
-            <w:tcW w:type="dxa" w:w="1905"/>
+            <w:tcW w:type="dxa" w:w="916"/>
             <w:tcBorders>
               <w:top w:val="single" w:color="000000" w:sz="4"/>
               <w:left w:val="single" w:color="000000" w:sz="4"/>
@@ -5865,7 +5865,7 @@
         </w:trPr>
         <w:tc>
           <w:tcPr>
-            <w:tcW w:type="dxa" w:w="1895"/>
+            <w:tcW w:type="dxa" w:w="2537"/>
             <w:tcBorders>
               <w:top w:val="single" w:color="000000" w:sz="4"/>
               <w:left w:val="single" w:color="000000" w:sz="4"/>
@@ -5902,31 +5902,31 @@
         </w:tc>
         <w:tc>
           <w:tcPr>
-            <w:tcW w:type="dxa" w:w="1126"/>
-            <w:tcBorders>
-              <w:top w:val="single" w:color="000000" w:sz="4"/>
-              <w:left w:val="single" w:color="000000" w:sz="4"/>
-              <w:bottom w:val="single" w:color="000000" w:sz="4"/>
-              <w:right w:val="single" w:color="000000" w:sz="4"/>
-            </w:tcBorders>
-            <w:tcMar>
-              <w:top w:type="dxa" w:w="30"/>
-              <w:left w:type="dxa" w:w="70"/>
-              <w:bottom w:type="dxa" w:w="30"/>
-              <w:right w:type="dxa" w:w="70"/>
-            </w:tcMar>
-            <w:vAlign w:val="center"/>
-          </w:tcPr>
-          <w:p>
-            <w:pPr>
-              <w:spacing w:after="0" w:before="0" w:line="240" w:lineRule="auto"/>
-              <w:jc w:val="left"/>
-            </w:pPr>
-          </w:p>
-        </w:tc>
-        <w:tc>
-          <w:tcPr>
-            <w:tcW w:type="dxa" w:w="1548"/>
+            <w:tcW w:type="dxa" w:w="772"/>
+            <w:tcBorders>
+              <w:top w:val="single" w:color="000000" w:sz="4"/>
+              <w:left w:val="single" w:color="000000" w:sz="4"/>
+              <w:bottom w:val="single" w:color="000000" w:sz="4"/>
+              <w:right w:val="single" w:color="000000" w:sz="4"/>
+            </w:tcBorders>
+            <w:tcMar>
+              <w:top w:type="dxa" w:w="30"/>
+              <w:left w:type="dxa" w:w="70"/>
+              <w:bottom w:type="dxa" w:w="30"/>
+              <w:right w:type="dxa" w:w="70"/>
+            </w:tcMar>
+            <w:vAlign w:val="center"/>
+          </w:tcPr>
+          <w:p>
+            <w:pPr>
+              <w:spacing w:after="0" w:before="0" w:line="240" w:lineRule="auto"/>
+              <w:jc w:val="left"/>
+            </w:pPr>
+          </w:p>
+        </w:tc>
+        <w:tc>
+          <w:tcPr>
+            <w:tcW w:type="dxa" w:w="2255"/>
             <w:tcBorders>
               <w:top w:val="single" w:color="000000" w:sz="4"/>
               <w:left w:val="single" w:color="000000" w:sz="4"/>
@@ -5962,55 +5962,55 @@
         </w:tc>
         <w:tc>
           <w:tcPr>
-            <w:tcW w:type="dxa" w:w="1370"/>
-            <w:tcBorders>
-              <w:top w:val="single" w:color="000000" w:sz="4"/>
-              <w:left w:val="single" w:color="000000" w:sz="4"/>
-              <w:bottom w:val="single" w:color="000000" w:sz="4"/>
-              <w:right w:val="single" w:color="000000" w:sz="4"/>
-            </w:tcBorders>
-            <w:tcMar>
-              <w:top w:type="dxa" w:w="30"/>
-              <w:left w:type="dxa" w:w="70"/>
-              <w:bottom w:type="dxa" w:w="30"/>
-              <w:right w:type="dxa" w:w="70"/>
-            </w:tcMar>
-            <w:vAlign w:val="center"/>
-          </w:tcPr>
-          <w:p>
-            <w:pPr>
-              <w:spacing w:after="0" w:before="0" w:line="240" w:lineRule="auto"/>
-              <w:jc w:val="left"/>
-            </w:pPr>
-          </w:p>
-        </w:tc>
-        <w:tc>
-          <w:tcPr>
-            <w:tcW w:type="dxa" w:w="1181"/>
-            <w:tcBorders>
-              <w:top w:val="single" w:color="000000" w:sz="4"/>
-              <w:left w:val="single" w:color="000000" w:sz="4"/>
-              <w:bottom w:val="single" w:color="000000" w:sz="4"/>
-              <w:right w:val="single" w:color="000000" w:sz="4"/>
-            </w:tcBorders>
-            <w:tcMar>
-              <w:top w:type="dxa" w:w="30"/>
-              <w:left w:type="dxa" w:w="70"/>
-              <w:bottom w:type="dxa" w:w="30"/>
-              <w:right w:type="dxa" w:w="70"/>
-            </w:tcMar>
-            <w:vAlign w:val="center"/>
-          </w:tcPr>
-          <w:p>
-            <w:pPr>
-              <w:spacing w:after="0" w:before="0" w:line="240" w:lineRule="auto"/>
-              <w:jc w:val="left"/>
-            </w:pPr>
-          </w:p>
-        </w:tc>
-        <w:tc>
-          <w:tcPr>
-            <w:tcW w:type="dxa" w:w="1905"/>
+            <w:tcW w:type="dxa" w:w="1773"/>
+            <w:tcBorders>
+              <w:top w:val="single" w:color="000000" w:sz="4"/>
+              <w:left w:val="single" w:color="000000" w:sz="4"/>
+              <w:bottom w:val="single" w:color="000000" w:sz="4"/>
+              <w:right w:val="single" w:color="000000" w:sz="4"/>
+            </w:tcBorders>
+            <w:tcMar>
+              <w:top w:type="dxa" w:w="30"/>
+              <w:left w:type="dxa" w:w="70"/>
+              <w:bottom w:type="dxa" w:w="30"/>
+              <w:right w:type="dxa" w:w="70"/>
+            </w:tcMar>
+            <w:vAlign w:val="center"/>
+          </w:tcPr>
+          <w:p>
+            <w:pPr>
+              <w:spacing w:after="0" w:before="0" w:line="240" w:lineRule="auto"/>
+              <w:jc w:val="left"/>
+            </w:pPr>
+          </w:p>
+        </w:tc>
+        <w:tc>
+          <w:tcPr>
+            <w:tcW w:type="dxa" w:w="772"/>
+            <w:tcBorders>
+              <w:top w:val="single" w:color="000000" w:sz="4"/>
+              <w:left w:val="single" w:color="000000" w:sz="4"/>
+              <w:bottom w:val="single" w:color="000000" w:sz="4"/>
+              <w:right w:val="single" w:color="000000" w:sz="4"/>
+            </w:tcBorders>
+            <w:tcMar>
+              <w:top w:type="dxa" w:w="30"/>
+              <w:left w:type="dxa" w:w="70"/>
+              <w:bottom w:type="dxa" w:w="30"/>
+              <w:right w:type="dxa" w:w="70"/>
+            </w:tcMar>
+            <w:vAlign w:val="center"/>
+          </w:tcPr>
+          <w:p>
+            <w:pPr>
+              <w:spacing w:after="0" w:before="0" w:line="240" w:lineRule="auto"/>
+              <w:jc w:val="left"/>
+            </w:pPr>
+          </w:p>
+        </w:tc>
+        <w:tc>
+          <w:tcPr>
+            <w:tcW w:type="dxa" w:w="916"/>
             <w:tcBorders>
               <w:top w:val="single" w:color="000000" w:sz="4"/>
               <w:left w:val="single" w:color="000000" w:sz="4"/>
@@ -6093,9 +6093,9 @@
         <w:tblLayout w:type="autofit"/>
       </w:tblPr>
       <w:tblGrid>
-        <w:gridCol w:w="3330"/>
-        <w:gridCol w:w="2364"/>
-        <w:gridCol w:w="3331"/>
+        <w:gridCol w:w="2742"/>
+        <w:gridCol w:w="1920"/>
+        <w:gridCol w:w="4363"/>
       </w:tblGrid>
       <w:tr>
         <w:trPr>
@@ -6104,7 +6104,7 @@
         </w:trPr>
         <w:tc>
           <w:tcPr>
-            <w:tcW w:type="dxa" w:w="3330"/>
+            <w:tcW w:type="dxa" w:w="2742"/>
             <w:tcBorders>
               <w:top w:val="single" w:color="000000" w:sz="4"/>
               <w:left w:val="single" w:color="000000" w:sz="4"/>
@@ -6141,7 +6141,7 @@
         </w:tc>
         <w:tc>
           <w:tcPr>
-            <w:tcW w:type="dxa" w:w="2364"/>
+            <w:tcW w:type="dxa" w:w="1920"/>
             <w:tcBorders>
               <w:top w:val="single" w:color="000000" w:sz="4"/>
               <w:left w:val="single" w:color="000000" w:sz="4"/>
@@ -6178,7 +6178,7 @@
         </w:tc>
         <w:tc>
           <w:tcPr>
-            <w:tcW w:type="dxa" w:w="3331"/>
+            <w:tcW w:type="dxa" w:w="4363"/>
             <w:tcBorders>
               <w:top w:val="single" w:color="000000" w:sz="4"/>
               <w:left w:val="single" w:color="000000" w:sz="4"/>
@@ -6221,7 +6221,7 @@
         </w:trPr>
         <w:tc>
           <w:tcPr>
-            <w:tcW w:type="dxa" w:w="3330"/>
+            <w:tcW w:type="dxa" w:w="2742"/>
             <w:tcBorders>
               <w:top w:val="single" w:color="000000" w:sz="4"/>
               <w:left w:val="single" w:color="000000" w:sz="4"/>
@@ -6257,31 +6257,31 @@
         </w:tc>
         <w:tc>
           <w:tcPr>
-            <w:tcW w:type="dxa" w:w="2364"/>
-            <w:tcBorders>
-              <w:top w:val="single" w:color="000000" w:sz="4"/>
-              <w:left w:val="single" w:color="000000" w:sz="4"/>
-              <w:bottom w:val="single" w:color="000000" w:sz="4"/>
-              <w:right w:val="single" w:color="000000" w:sz="4"/>
-            </w:tcBorders>
-            <w:tcMar>
-              <w:top w:type="dxa" w:w="30"/>
-              <w:left w:type="dxa" w:w="70"/>
-              <w:bottom w:type="dxa" w:w="30"/>
-              <w:right w:type="dxa" w:w="70"/>
-            </w:tcMar>
-            <w:vAlign w:val="center"/>
-          </w:tcPr>
-          <w:p>
-            <w:pPr>
-              <w:spacing w:after="0" w:before="0" w:line="240" w:lineRule="auto"/>
-              <w:jc w:val="left"/>
-            </w:pPr>
-          </w:p>
-        </w:tc>
-        <w:tc>
-          <w:tcPr>
-            <w:tcW w:type="dxa" w:w="3331"/>
+            <w:tcW w:type="dxa" w:w="1920"/>
+            <w:tcBorders>
+              <w:top w:val="single" w:color="000000" w:sz="4"/>
+              <w:left w:val="single" w:color="000000" w:sz="4"/>
+              <w:bottom w:val="single" w:color="000000" w:sz="4"/>
+              <w:right w:val="single" w:color="000000" w:sz="4"/>
+            </w:tcBorders>
+            <w:tcMar>
+              <w:top w:type="dxa" w:w="30"/>
+              <w:left w:type="dxa" w:w="70"/>
+              <w:bottom w:type="dxa" w:w="30"/>
+              <w:right w:type="dxa" w:w="70"/>
+            </w:tcMar>
+            <w:vAlign w:val="center"/>
+          </w:tcPr>
+          <w:p>
+            <w:pPr>
+              <w:spacing w:after="0" w:before="0" w:line="240" w:lineRule="auto"/>
+              <w:jc w:val="left"/>
+            </w:pPr>
+          </w:p>
+        </w:tc>
+        <w:tc>
+          <w:tcPr>
+            <w:tcW w:type="dxa" w:w="4363"/>
             <w:tcBorders>
               <w:top w:val="single" w:color="000000" w:sz="4"/>
               <w:left w:val="single" w:color="000000" w:sz="4"/>
@@ -6323,7 +6323,7 @@
         </w:trPr>
         <w:tc>
           <w:tcPr>
-            <w:tcW w:type="dxa" w:w="3330"/>
+            <w:tcW w:type="dxa" w:w="2742"/>
             <w:tcBorders>
               <w:top w:val="single" w:color="000000" w:sz="4"/>
               <w:left w:val="single" w:color="000000" w:sz="4"/>
@@ -6359,7 +6359,7 @@
         </w:tc>
         <w:tc>
           <w:tcPr>
-            <w:tcW w:type="dxa" w:w="2364"/>
+            <w:tcW w:type="dxa" w:w="1920"/>
             <w:tcBorders>
               <w:top w:val="single" w:color="000000" w:sz="4"/>
               <w:left w:val="single" w:color="000000" w:sz="4"/>
@@ -6395,7 +6395,7 @@
         </w:tc>
         <w:tc>
           <w:tcPr>
-            <w:tcW w:type="dxa" w:w="3331"/>
+            <w:tcW w:type="dxa" w:w="4363"/>
             <w:tcBorders>
               <w:top w:val="single" w:color="000000" w:sz="4"/>
               <w:left w:val="single" w:color="000000" w:sz="4"/>
@@ -6425,7 +6425,7 @@
         </w:trPr>
         <w:tc>
           <w:tcPr>
-            <w:tcW w:type="dxa" w:w="3330"/>
+            <w:tcW w:type="dxa" w:w="2742"/>
             <w:tcBorders>
               <w:top w:val="single" w:color="000000" w:sz="4"/>
               <w:left w:val="single" w:color="000000" w:sz="4"/>
@@ -6461,31 +6461,31 @@
         </w:tc>
         <w:tc>
           <w:tcPr>
-            <w:tcW w:type="dxa" w:w="2364"/>
-            <w:tcBorders>
-              <w:top w:val="single" w:color="000000" w:sz="4"/>
-              <w:left w:val="single" w:color="000000" w:sz="4"/>
-              <w:bottom w:val="single" w:color="000000" w:sz="4"/>
-              <w:right w:val="single" w:color="000000" w:sz="4"/>
-            </w:tcBorders>
-            <w:tcMar>
-              <w:top w:type="dxa" w:w="30"/>
-              <w:left w:type="dxa" w:w="70"/>
-              <w:bottom w:type="dxa" w:w="30"/>
-              <w:right w:type="dxa" w:w="70"/>
-            </w:tcMar>
-            <w:vAlign w:val="center"/>
-          </w:tcPr>
-          <w:p>
-            <w:pPr>
-              <w:spacing w:after="0" w:before="0" w:line="240" w:lineRule="auto"/>
-              <w:jc w:val="left"/>
-            </w:pPr>
-          </w:p>
-        </w:tc>
-        <w:tc>
-          <w:tcPr>
-            <w:tcW w:type="dxa" w:w="3331"/>
+            <w:tcW w:type="dxa" w:w="1920"/>
+            <w:tcBorders>
+              <w:top w:val="single" w:color="000000" w:sz="4"/>
+              <w:left w:val="single" w:color="000000" w:sz="4"/>
+              <w:bottom w:val="single" w:color="000000" w:sz="4"/>
+              <w:right w:val="single" w:color="000000" w:sz="4"/>
+            </w:tcBorders>
+            <w:tcMar>
+              <w:top w:type="dxa" w:w="30"/>
+              <w:left w:type="dxa" w:w="70"/>
+              <w:bottom w:type="dxa" w:w="30"/>
+              <w:right w:type="dxa" w:w="70"/>
+            </w:tcMar>
+            <w:vAlign w:val="center"/>
+          </w:tcPr>
+          <w:p>
+            <w:pPr>
+              <w:spacing w:after="0" w:before="0" w:line="240" w:lineRule="auto"/>
+              <w:jc w:val="left"/>
+            </w:pPr>
+          </w:p>
+        </w:tc>
+        <w:tc>
+          <w:tcPr>
+            <w:tcW w:type="dxa" w:w="4363"/>
             <w:tcBorders>
               <w:top w:val="single" w:color="000000" w:sz="4"/>
               <w:left w:val="single" w:color="000000" w:sz="4"/>
@@ -6515,7 +6515,7 @@
         </w:trPr>
         <w:tc>
           <w:tcPr>
-            <w:tcW w:type="dxa" w:w="3330"/>
+            <w:tcW w:type="dxa" w:w="2742"/>
             <w:tcBorders>
               <w:top w:val="single" w:color="000000" w:sz="4"/>
               <w:left w:val="single" w:color="000000" w:sz="4"/>
@@ -6551,7 +6551,7 @@
         </w:tc>
         <w:tc>
           <w:tcPr>
-            <w:tcW w:type="dxa" w:w="2364"/>
+            <w:tcW w:type="dxa" w:w="1920"/>
             <w:tcBorders>
               <w:top w:val="single" w:color="000000" w:sz="4"/>
               <w:left w:val="single" w:color="000000" w:sz="4"/>
@@ -6587,7 +6587,7 @@
         </w:tc>
         <w:tc>
           <w:tcPr>
-            <w:tcW w:type="dxa" w:w="3331"/>
+            <w:tcW w:type="dxa" w:w="4363"/>
             <w:tcBorders>
               <w:top w:val="single" w:color="000000" w:sz="4"/>
               <w:left w:val="single" w:color="000000" w:sz="4"/>
@@ -6617,7 +6617,7 @@
         </w:trPr>
         <w:tc>
           <w:tcPr>
-            <w:tcW w:type="dxa" w:w="3330"/>
+            <w:tcW w:type="dxa" w:w="2742"/>
             <w:tcBorders>
               <w:top w:val="single" w:color="000000" w:sz="4"/>
               <w:left w:val="single" w:color="000000" w:sz="4"/>
@@ -6653,31 +6653,31 @@
         </w:tc>
         <w:tc>
           <w:tcPr>
-            <w:tcW w:type="dxa" w:w="2364"/>
-            <w:tcBorders>
-              <w:top w:val="single" w:color="000000" w:sz="4"/>
-              <w:left w:val="single" w:color="000000" w:sz="4"/>
-              <w:bottom w:val="single" w:color="000000" w:sz="4"/>
-              <w:right w:val="single" w:color="000000" w:sz="4"/>
-            </w:tcBorders>
-            <w:tcMar>
-              <w:top w:type="dxa" w:w="30"/>
-              <w:left w:type="dxa" w:w="70"/>
-              <w:bottom w:type="dxa" w:w="30"/>
-              <w:right w:type="dxa" w:w="70"/>
-            </w:tcMar>
-            <w:vAlign w:val="center"/>
-          </w:tcPr>
-          <w:p>
-            <w:pPr>
-              <w:spacing w:after="0" w:before="0" w:line="240" w:lineRule="auto"/>
-              <w:jc w:val="left"/>
-            </w:pPr>
-          </w:p>
-        </w:tc>
-        <w:tc>
-          <w:tcPr>
-            <w:tcW w:type="dxa" w:w="3331"/>
+            <w:tcW w:type="dxa" w:w="1920"/>
+            <w:tcBorders>
+              <w:top w:val="single" w:color="000000" w:sz="4"/>
+              <w:left w:val="single" w:color="000000" w:sz="4"/>
+              <w:bottom w:val="single" w:color="000000" w:sz="4"/>
+              <w:right w:val="single" w:color="000000" w:sz="4"/>
+            </w:tcBorders>
+            <w:tcMar>
+              <w:top w:type="dxa" w:w="30"/>
+              <w:left w:type="dxa" w:w="70"/>
+              <w:bottom w:type="dxa" w:w="30"/>
+              <w:right w:type="dxa" w:w="70"/>
+            </w:tcMar>
+            <w:vAlign w:val="center"/>
+          </w:tcPr>
+          <w:p>
+            <w:pPr>
+              <w:spacing w:after="0" w:before="0" w:line="240" w:lineRule="auto"/>
+              <w:jc w:val="left"/>
+            </w:pPr>
+          </w:p>
+        </w:tc>
+        <w:tc>
+          <w:tcPr>
+            <w:tcW w:type="dxa" w:w="4363"/>
             <w:tcBorders>
               <w:top w:val="single" w:color="000000" w:sz="4"/>
               <w:left w:val="single" w:color="000000" w:sz="4"/>
@@ -6707,7 +6707,7 @@
         </w:trPr>
         <w:tc>
           <w:tcPr>
-            <w:tcW w:type="dxa" w:w="3330"/>
+            <w:tcW w:type="dxa" w:w="2742"/>
             <w:tcBorders>
               <w:top w:val="single" w:color="000000" w:sz="4"/>
               <w:left w:val="single" w:color="000000" w:sz="4"/>
@@ -6743,31 +6743,31 @@
         </w:tc>
         <w:tc>
           <w:tcPr>
-            <w:tcW w:type="dxa" w:w="2364"/>
-            <w:tcBorders>
-              <w:top w:val="single" w:color="000000" w:sz="4"/>
-              <w:left w:val="single" w:color="000000" w:sz="4"/>
-              <w:bottom w:val="single" w:color="000000" w:sz="4"/>
-              <w:right w:val="single" w:color="000000" w:sz="4"/>
-            </w:tcBorders>
-            <w:tcMar>
-              <w:top w:type="dxa" w:w="30"/>
-              <w:left w:type="dxa" w:w="70"/>
-              <w:bottom w:type="dxa" w:w="30"/>
-              <w:right w:type="dxa" w:w="70"/>
-            </w:tcMar>
-            <w:vAlign w:val="center"/>
-          </w:tcPr>
-          <w:p>
-            <w:pPr>
-              <w:spacing w:after="0" w:before="0" w:line="240" w:lineRule="auto"/>
-              <w:jc w:val="left"/>
-            </w:pPr>
-          </w:p>
-        </w:tc>
-        <w:tc>
-          <w:tcPr>
-            <w:tcW w:type="dxa" w:w="3331"/>
+            <w:tcW w:type="dxa" w:w="1920"/>
+            <w:tcBorders>
+              <w:top w:val="single" w:color="000000" w:sz="4"/>
+              <w:left w:val="single" w:color="000000" w:sz="4"/>
+              <w:bottom w:val="single" w:color="000000" w:sz="4"/>
+              <w:right w:val="single" w:color="000000" w:sz="4"/>
+            </w:tcBorders>
+            <w:tcMar>
+              <w:top w:type="dxa" w:w="30"/>
+              <w:left w:type="dxa" w:w="70"/>
+              <w:bottom w:type="dxa" w:w="30"/>
+              <w:right w:type="dxa" w:w="70"/>
+            </w:tcMar>
+            <w:vAlign w:val="center"/>
+          </w:tcPr>
+          <w:p>
+            <w:pPr>
+              <w:spacing w:after="0" w:before="0" w:line="240" w:lineRule="auto"/>
+              <w:jc w:val="left"/>
+            </w:pPr>
+          </w:p>
+        </w:tc>
+        <w:tc>
+          <w:tcPr>
+            <w:tcW w:type="dxa" w:w="4363"/>
             <w:tcBorders>
               <w:top w:val="single" w:color="000000" w:sz="4"/>
               <w:left w:val="single" w:color="000000" w:sz="4"/>
@@ -6797,7 +6797,7 @@
         </w:trPr>
         <w:tc>
           <w:tcPr>
-            <w:tcW w:type="dxa" w:w="3330"/>
+            <w:tcW w:type="dxa" w:w="2742"/>
             <w:tcBorders>
               <w:top w:val="single" w:color="000000" w:sz="4"/>
               <w:left w:val="single" w:color="000000" w:sz="4"/>
@@ -6833,31 +6833,31 @@
         </w:tc>
         <w:tc>
           <w:tcPr>
-            <w:tcW w:type="dxa" w:w="2364"/>
-            <w:tcBorders>
-              <w:top w:val="single" w:color="000000" w:sz="4"/>
-              <w:left w:val="single" w:color="000000" w:sz="4"/>
-              <w:bottom w:val="single" w:color="000000" w:sz="4"/>
-              <w:right w:val="single" w:color="000000" w:sz="4"/>
-            </w:tcBorders>
-            <w:tcMar>
-              <w:top w:type="dxa" w:w="30"/>
-              <w:left w:type="dxa" w:w="70"/>
-              <w:bottom w:type="dxa" w:w="30"/>
-              <w:right w:type="dxa" w:w="70"/>
-            </w:tcMar>
-            <w:vAlign w:val="center"/>
-          </w:tcPr>
-          <w:p>
-            <w:pPr>
-              <w:spacing w:after="0" w:before="0" w:line="240" w:lineRule="auto"/>
-              <w:jc w:val="left"/>
-            </w:pPr>
-          </w:p>
-        </w:tc>
-        <w:tc>
-          <w:tcPr>
-            <w:tcW w:type="dxa" w:w="3331"/>
+            <w:tcW w:type="dxa" w:w="1920"/>
+            <w:tcBorders>
+              <w:top w:val="single" w:color="000000" w:sz="4"/>
+              <w:left w:val="single" w:color="000000" w:sz="4"/>
+              <w:bottom w:val="single" w:color="000000" w:sz="4"/>
+              <w:right w:val="single" w:color="000000" w:sz="4"/>
+            </w:tcBorders>
+            <w:tcMar>
+              <w:top w:type="dxa" w:w="30"/>
+              <w:left w:type="dxa" w:w="70"/>
+              <w:bottom w:type="dxa" w:w="30"/>
+              <w:right w:type="dxa" w:w="70"/>
+            </w:tcMar>
+            <w:vAlign w:val="center"/>
+          </w:tcPr>
+          <w:p>
+            <w:pPr>
+              <w:spacing w:after="0" w:before="0" w:line="240" w:lineRule="auto"/>
+              <w:jc w:val="left"/>
+            </w:pPr>
+          </w:p>
+        </w:tc>
+        <w:tc>
+          <w:tcPr>
+            <w:tcW w:type="dxa" w:w="4363"/>
             <w:tcBorders>
               <w:top w:val="single" w:color="000000" w:sz="4"/>
               <w:left w:val="single" w:color="000000" w:sz="4"/>
@@ -6921,9 +6921,9 @@
         <w:tblLayout w:type="autofit"/>
       </w:tblPr>
       <w:tblGrid>
-        <w:gridCol w:w="3905"/>
-        <w:gridCol w:w="3905"/>
-        <w:gridCol w:w="1215"/>
+        <w:gridCol w:w="3212"/>
+        <w:gridCol w:w="4556"/>
+        <w:gridCol w:w="1257"/>
       </w:tblGrid>
       <w:tr>
         <w:trPr>
@@ -6932,7 +6932,7 @@
         </w:trPr>
         <w:tc>
           <w:tcPr>
-            <w:tcW w:type="dxa" w:w="3905"/>
+            <w:tcW w:type="dxa" w:w="3212"/>
             <w:tcBorders>
               <w:top w:val="single" w:color="000000" w:sz="4"/>
               <w:left w:val="single" w:color="000000" w:sz="4"/>
@@ -6969,7 +6969,7 @@
         </w:tc>
         <w:tc>
           <w:tcPr>
-            <w:tcW w:type="dxa" w:w="3905"/>
+            <w:tcW w:type="dxa" w:w="4556"/>
             <w:tcBorders>
               <w:top w:val="single" w:color="000000" w:sz="4"/>
               <w:left w:val="single" w:color="000000" w:sz="4"/>
@@ -7006,7 +7006,7 @@
         </w:tc>
         <w:tc>
           <w:tcPr>
-            <w:tcW w:type="dxa" w:w="1215"/>
+            <w:tcW w:type="dxa" w:w="1257"/>
             <w:tcBorders>
               <w:top w:val="single" w:color="000000" w:sz="4"/>
               <w:left w:val="single" w:color="000000" w:sz="4"/>
@@ -7049,7 +7049,7 @@
         </w:trPr>
         <w:tc>
           <w:tcPr>
-            <w:tcW w:type="dxa" w:w="3905"/>
+            <w:tcW w:type="dxa" w:w="3212"/>
             <w:tcBorders>
               <w:top w:val="single" w:color="000000" w:sz="4"/>
               <w:left w:val="single" w:color="000000" w:sz="4"/>
@@ -7086,7 +7086,7 @@
         </w:tc>
         <w:tc>
           <w:tcPr>
-            <w:tcW w:type="dxa" w:w="3905"/>
+            <w:tcW w:type="dxa" w:w="4556"/>
             <w:tcBorders>
               <w:top w:val="single" w:color="000000" w:sz="4"/>
               <w:left w:val="single" w:color="000000" w:sz="4"/>
@@ -7122,7 +7122,7 @@
         </w:tc>
         <w:tc>
           <w:tcPr>
-            <w:tcW w:type="dxa" w:w="1215"/>
+            <w:tcW w:type="dxa" w:w="1257"/>
             <w:tcBorders>
               <w:top w:val="single" w:color="000000" w:sz="4"/>
               <w:left w:val="single" w:color="000000" w:sz="4"/>
@@ -7152,7 +7152,7 @@
         </w:trPr>
         <w:tc>
           <w:tcPr>
-            <w:tcW w:type="dxa" w:w="3905"/>
+            <w:tcW w:type="dxa" w:w="3212"/>
             <w:tcBorders>
               <w:top w:val="single" w:color="000000" w:sz="4"/>
               <w:left w:val="single" w:color="000000" w:sz="4"/>
@@ -7189,31 +7189,31 @@
         </w:tc>
         <w:tc>
           <w:tcPr>
-            <w:tcW w:type="dxa" w:w="3905"/>
-            <w:tcBorders>
-              <w:top w:val="single" w:color="000000" w:sz="4"/>
-              <w:left w:val="single" w:color="000000" w:sz="4"/>
-              <w:bottom w:val="single" w:color="000000" w:sz="4"/>
-              <w:right w:val="single" w:color="000000" w:sz="4"/>
-            </w:tcBorders>
-            <w:tcMar>
-              <w:top w:type="dxa" w:w="30"/>
-              <w:left w:type="dxa" w:w="70"/>
-              <w:bottom w:type="dxa" w:w="30"/>
-              <w:right w:type="dxa" w:w="70"/>
-            </w:tcMar>
-            <w:vAlign w:val="center"/>
-          </w:tcPr>
-          <w:p>
-            <w:pPr>
-              <w:spacing w:after="0" w:before="0" w:line="240" w:lineRule="auto"/>
-              <w:jc w:val="left"/>
-            </w:pPr>
-          </w:p>
-        </w:tc>
-        <w:tc>
-          <w:tcPr>
-            <w:tcW w:type="dxa" w:w="1215"/>
+            <w:tcW w:type="dxa" w:w="4556"/>
+            <w:tcBorders>
+              <w:top w:val="single" w:color="000000" w:sz="4"/>
+              <w:left w:val="single" w:color="000000" w:sz="4"/>
+              <w:bottom w:val="single" w:color="000000" w:sz="4"/>
+              <w:right w:val="single" w:color="000000" w:sz="4"/>
+            </w:tcBorders>
+            <w:tcMar>
+              <w:top w:type="dxa" w:w="30"/>
+              <w:left w:type="dxa" w:w="70"/>
+              <w:bottom w:type="dxa" w:w="30"/>
+              <w:right w:type="dxa" w:w="70"/>
+            </w:tcMar>
+            <w:vAlign w:val="center"/>
+          </w:tcPr>
+          <w:p>
+            <w:pPr>
+              <w:spacing w:after="0" w:before="0" w:line="240" w:lineRule="auto"/>
+              <w:jc w:val="left"/>
+            </w:pPr>
+          </w:p>
+        </w:tc>
+        <w:tc>
+          <w:tcPr>
+            <w:tcW w:type="dxa" w:w="1257"/>
             <w:tcBorders>
               <w:top w:val="single" w:color="000000" w:sz="4"/>
               <w:left w:val="single" w:color="000000" w:sz="4"/>
@@ -7243,7 +7243,7 @@
         </w:trPr>
         <w:tc>
           <w:tcPr>
-            <w:tcW w:type="dxa" w:w="3905"/>
+            <w:tcW w:type="dxa" w:w="3212"/>
             <w:tcBorders>
               <w:top w:val="single" w:color="000000" w:sz="4"/>
               <w:left w:val="single" w:color="000000" w:sz="4"/>
@@ -7279,7 +7279,7 @@
         </w:tc>
         <w:tc>
           <w:tcPr>
-            <w:tcW w:type="dxa" w:w="3905"/>
+            <w:tcW w:type="dxa" w:w="4556"/>
             <w:tcBorders>
               <w:top w:val="single" w:color="000000" w:sz="4"/>
               <w:left w:val="single" w:color="000000" w:sz="4"/>
@@ -7315,7 +7315,7 @@
         </w:tc>
         <w:tc>
           <w:tcPr>
-            <w:tcW w:type="dxa" w:w="1215"/>
+            <w:tcW w:type="dxa" w:w="1257"/>
             <w:tcBorders>
               <w:top w:val="single" w:color="000000" w:sz="4"/>
               <w:left w:val="single" w:color="000000" w:sz="4"/>
@@ -7345,7 +7345,7 @@
         </w:trPr>
         <w:tc>
           <w:tcPr>
-            <w:tcW w:type="dxa" w:w="3905"/>
+            <w:tcW w:type="dxa" w:w="3212"/>
             <w:tcBorders>
               <w:top w:val="single" w:color="000000" w:sz="4"/>
               <w:left w:val="single" w:color="000000" w:sz="4"/>
@@ -7381,31 +7381,31 @@
         </w:tc>
         <w:tc>
           <w:tcPr>
-            <w:tcW w:type="dxa" w:w="3905"/>
-            <w:tcBorders>
-              <w:top w:val="single" w:color="000000" w:sz="4"/>
-              <w:left w:val="single" w:color="000000" w:sz="4"/>
-              <w:bottom w:val="single" w:color="000000" w:sz="4"/>
-              <w:right w:val="single" w:color="000000" w:sz="4"/>
-            </w:tcBorders>
-            <w:tcMar>
-              <w:top w:type="dxa" w:w="30"/>
-              <w:left w:type="dxa" w:w="70"/>
-              <w:bottom w:type="dxa" w:w="30"/>
-              <w:right w:type="dxa" w:w="70"/>
-            </w:tcMar>
-            <w:vAlign w:val="center"/>
-          </w:tcPr>
-          <w:p>
-            <w:pPr>
-              <w:spacing w:after="0" w:before="0" w:line="240" w:lineRule="auto"/>
-              <w:jc w:val="left"/>
-            </w:pPr>
-          </w:p>
-        </w:tc>
-        <w:tc>
-          <w:tcPr>
-            <w:tcW w:type="dxa" w:w="1215"/>
+            <w:tcW w:type="dxa" w:w="4556"/>
+            <w:tcBorders>
+              <w:top w:val="single" w:color="000000" w:sz="4"/>
+              <w:left w:val="single" w:color="000000" w:sz="4"/>
+              <w:bottom w:val="single" w:color="000000" w:sz="4"/>
+              <w:right w:val="single" w:color="000000" w:sz="4"/>
+            </w:tcBorders>
+            <w:tcMar>
+              <w:top w:type="dxa" w:w="30"/>
+              <w:left w:type="dxa" w:w="70"/>
+              <w:bottom w:type="dxa" w:w="30"/>
+              <w:right w:type="dxa" w:w="70"/>
+            </w:tcMar>
+            <w:vAlign w:val="center"/>
+          </w:tcPr>
+          <w:p>
+            <w:pPr>
+              <w:spacing w:after="0" w:before="0" w:line="240" w:lineRule="auto"/>
+              <w:jc w:val="left"/>
+            </w:pPr>
+          </w:p>
+        </w:tc>
+        <w:tc>
+          <w:tcPr>
+            <w:tcW w:type="dxa" w:w="1257"/>
             <w:tcBorders>
               <w:top w:val="single" w:color="000000" w:sz="4"/>
               <w:left w:val="single" w:color="000000" w:sz="4"/>
@@ -7448,7 +7448,7 @@
         </w:trPr>
         <w:tc>
           <w:tcPr>
-            <w:tcW w:type="dxa" w:w="3905"/>
+            <w:tcW w:type="dxa" w:w="3212"/>
             <w:tcBorders>
               <w:top w:val="single" w:color="000000" w:sz="4"/>
               <w:left w:val="single" w:color="000000" w:sz="4"/>
@@ -7484,7 +7484,7 @@
         </w:tc>
         <w:tc>
           <w:tcPr>
-            <w:tcW w:type="dxa" w:w="3905"/>
+            <w:tcW w:type="dxa" w:w="4556"/>
             <w:tcBorders>
               <w:top w:val="single" w:color="000000" w:sz="4"/>
               <w:left w:val="single" w:color="000000" w:sz="4"/>
@@ -7520,7 +7520,7 @@
         </w:tc>
         <w:tc>
           <w:tcPr>
-            <w:tcW w:type="dxa" w:w="1215"/>
+            <w:tcW w:type="dxa" w:w="1257"/>
             <w:tcBorders>
               <w:top w:val="single" w:color="000000" w:sz="4"/>
               <w:left w:val="single" w:color="000000" w:sz="4"/>
@@ -7550,7 +7550,7 @@
         </w:trPr>
         <w:tc>
           <w:tcPr>
-            <w:tcW w:type="dxa" w:w="3905"/>
+            <w:tcW w:type="dxa" w:w="3212"/>
             <w:tcBorders>
               <w:top w:val="single" w:color="000000" w:sz="4"/>
               <w:left w:val="single" w:color="000000" w:sz="4"/>
@@ -7586,7 +7586,7 @@
         </w:tc>
         <w:tc>
           <w:tcPr>
-            <w:tcW w:type="dxa" w:w="3905"/>
+            <w:tcW w:type="dxa" w:w="4556"/>
             <w:tcBorders>
               <w:top w:val="single" w:color="000000" w:sz="4"/>
               <w:left w:val="single" w:color="000000" w:sz="4"/>
@@ -7623,7 +7623,7 @@
         </w:tc>
         <w:tc>
           <w:tcPr>
-            <w:tcW w:type="dxa" w:w="1215"/>
+            <w:tcW w:type="dxa" w:w="1257"/>
             <w:tcBorders>
               <w:top w:val="single" w:color="000000" w:sz="4"/>
               <w:left w:val="single" w:color="000000" w:sz="4"/>
@@ -7653,7 +7653,7 @@
         </w:trPr>
         <w:tc>
           <w:tcPr>
-            <w:tcW w:type="dxa" w:w="3905"/>
+            <w:tcW w:type="dxa" w:w="3212"/>
             <w:tcBorders>
               <w:top w:val="single" w:color="000000" w:sz="4"/>
               <w:left w:val="single" w:color="000000" w:sz="4"/>
@@ -7689,7 +7689,7 @@
         </w:tc>
         <w:tc>
           <w:tcPr>
-            <w:tcW w:type="dxa" w:w="3905"/>
+            <w:tcW w:type="dxa" w:w="4556"/>
             <w:tcBorders>
               <w:top w:val="single" w:color="000000" w:sz="4"/>
               <w:left w:val="single" w:color="000000" w:sz="4"/>
@@ -7725,7 +7725,7 @@
         </w:tc>
         <w:tc>
           <w:tcPr>
-            <w:tcW w:type="dxa" w:w="1215"/>
+            <w:tcW w:type="dxa" w:w="1257"/>
             <w:tcBorders>
               <w:top w:val="single" w:color="000000" w:sz="4"/>
               <w:left w:val="single" w:color="000000" w:sz="4"/>
@@ -7789,11 +7789,11 @@
         <w:tblLayout w:type="autofit"/>
       </w:tblPr>
       <w:tblGrid>
-        <w:gridCol w:w="3484"/>
-        <w:gridCol w:w="1466"/>
-        <w:gridCol w:w="1716"/>
-        <w:gridCol w:w="644"/>
-        <w:gridCol w:w="1715"/>
+        <w:gridCol w:w="4314"/>
+        <w:gridCol w:w="1773"/>
+        <w:gridCol w:w="1187"/>
+        <w:gridCol w:w="830"/>
+        <w:gridCol w:w="921"/>
       </w:tblGrid>
       <w:tr>
         <w:trPr>
@@ -7802,7 +7802,7 @@
         </w:trPr>
         <w:tc>
           <w:tcPr>
-            <w:tcW w:type="dxa" w:w="3484"/>
+            <w:tcW w:type="dxa" w:w="4314"/>
             <w:tcBorders>
               <w:top w:val="single" w:color="000000" w:sz="4"/>
               <w:left w:val="single" w:color="000000" w:sz="4"/>
@@ -7839,7 +7839,7 @@
         </w:tc>
         <w:tc>
           <w:tcPr>
-            <w:tcW w:type="dxa" w:w="1466"/>
+            <w:tcW w:type="dxa" w:w="1773"/>
             <w:tcBorders>
               <w:top w:val="single" w:color="000000" w:sz="4"/>
               <w:left w:val="single" w:color="000000" w:sz="4"/>
@@ -7876,7 +7876,7 @@
         </w:tc>
         <w:tc>
           <w:tcPr>
-            <w:tcW w:type="dxa" w:w="1716"/>
+            <w:tcW w:type="dxa" w:w="1187"/>
             <w:tcBorders>
               <w:top w:val="single" w:color="000000" w:sz="4"/>
               <w:left w:val="single" w:color="000000" w:sz="4"/>
@@ -7913,7 +7913,7 @@
         </w:tc>
         <w:tc>
           <w:tcPr>
-            <w:tcW w:type="dxa" w:w="644"/>
+            <w:tcW w:type="dxa" w:w="830"/>
             <w:tcBorders>
               <w:top w:val="single" w:color="000000" w:sz="4"/>
               <w:left w:val="single" w:color="000000" w:sz="4"/>
@@ -7950,7 +7950,7 @@
         </w:tc>
         <w:tc>
           <w:tcPr>
-            <w:tcW w:type="dxa" w:w="1715"/>
+            <w:tcW w:type="dxa" w:w="921"/>
             <w:tcBorders>
               <w:top w:val="single" w:color="000000" w:sz="4"/>
               <w:left w:val="single" w:color="000000" w:sz="4"/>
@@ -7993,7 +7993,7 @@
         </w:trPr>
         <w:tc>
           <w:tcPr>
-            <w:tcW w:type="dxa" w:w="3484"/>
+            <w:tcW w:type="dxa" w:w="4314"/>
             <w:tcBorders>
               <w:top w:val="single" w:color="000000" w:sz="4"/>
               <w:left w:val="single" w:color="000000" w:sz="4"/>
@@ -8029,7 +8029,7 @@
         </w:tc>
         <w:tc>
           <w:tcPr>
-            <w:tcW w:type="dxa" w:w="1466"/>
+            <w:tcW w:type="dxa" w:w="1773"/>
             <w:tcBorders>
               <w:top w:val="single" w:color="000000" w:sz="4"/>
               <w:left w:val="single" w:color="000000" w:sz="4"/>
@@ -8066,31 +8066,31 @@
         </w:tc>
         <w:tc>
           <w:tcPr>
-            <w:tcW w:type="dxa" w:w="1716"/>
-            <w:tcBorders>
-              <w:top w:val="single" w:color="000000" w:sz="4"/>
-              <w:left w:val="single" w:color="000000" w:sz="4"/>
-              <w:bottom w:val="single" w:color="000000" w:sz="4"/>
-              <w:right w:val="single" w:color="000000" w:sz="4"/>
-            </w:tcBorders>
-            <w:tcMar>
-              <w:top w:type="dxa" w:w="30"/>
-              <w:left w:type="dxa" w:w="70"/>
-              <w:bottom w:type="dxa" w:w="30"/>
-              <w:right w:type="dxa" w:w="70"/>
-            </w:tcMar>
-            <w:vAlign w:val="center"/>
-          </w:tcPr>
-          <w:p>
-            <w:pPr>
-              <w:spacing w:after="0" w:before="0" w:line="240" w:lineRule="auto"/>
-              <w:jc w:val="left"/>
-            </w:pPr>
-          </w:p>
-        </w:tc>
-        <w:tc>
-          <w:tcPr>
-            <w:tcW w:type="dxa" w:w="644"/>
+            <w:tcW w:type="dxa" w:w="1187"/>
+            <w:tcBorders>
+              <w:top w:val="single" w:color="000000" w:sz="4"/>
+              <w:left w:val="single" w:color="000000" w:sz="4"/>
+              <w:bottom w:val="single" w:color="000000" w:sz="4"/>
+              <w:right w:val="single" w:color="000000" w:sz="4"/>
+            </w:tcBorders>
+            <w:tcMar>
+              <w:top w:type="dxa" w:w="30"/>
+              <w:left w:type="dxa" w:w="70"/>
+              <w:bottom w:type="dxa" w:w="30"/>
+              <w:right w:type="dxa" w:w="70"/>
+            </w:tcMar>
+            <w:vAlign w:val="center"/>
+          </w:tcPr>
+          <w:p>
+            <w:pPr>
+              <w:spacing w:after="0" w:before="0" w:line="240" w:lineRule="auto"/>
+              <w:jc w:val="left"/>
+            </w:pPr>
+          </w:p>
+        </w:tc>
+        <w:tc>
+          <w:tcPr>
+            <w:tcW w:type="dxa" w:w="830"/>
             <w:tcBorders>
               <w:top w:val="single" w:color="000000" w:sz="4"/>
               <w:left w:val="single" w:color="000000" w:sz="4"/>
@@ -8127,7 +8127,7 @@
         </w:tc>
         <w:tc>
           <w:tcPr>
-            <w:tcW w:type="dxa" w:w="1715"/>
+            <w:tcW w:type="dxa" w:w="921"/>
             <w:tcBorders>
               <w:top w:val="single" w:color="000000" w:sz="4"/>
               <w:left w:val="single" w:color="000000" w:sz="4"/>
@@ -8157,7 +8157,7 @@
         </w:trPr>
         <w:tc>
           <w:tcPr>
-            <w:tcW w:type="dxa" w:w="3484"/>
+            <w:tcW w:type="dxa" w:w="4314"/>
             <w:tcBorders>
               <w:top w:val="single" w:color="000000" w:sz="4"/>
               <w:left w:val="single" w:color="000000" w:sz="4"/>
@@ -8193,7 +8193,7 @@
         </w:tc>
         <w:tc>
           <w:tcPr>
-            <w:tcW w:type="dxa" w:w="1466"/>
+            <w:tcW w:type="dxa" w:w="1773"/>
             <w:tcBorders>
               <w:top w:val="single" w:color="000000" w:sz="4"/>
               <w:left w:val="single" w:color="000000" w:sz="4"/>
@@ -8230,31 +8230,31 @@
         </w:tc>
         <w:tc>
           <w:tcPr>
-            <w:tcW w:type="dxa" w:w="1716"/>
-            <w:tcBorders>
-              <w:top w:val="single" w:color="000000" w:sz="4"/>
-              <w:left w:val="single" w:color="000000" w:sz="4"/>
-              <w:bottom w:val="single" w:color="000000" w:sz="4"/>
-              <w:right w:val="single" w:color="000000" w:sz="4"/>
-            </w:tcBorders>
-            <w:tcMar>
-              <w:top w:type="dxa" w:w="30"/>
-              <w:left w:type="dxa" w:w="70"/>
-              <w:bottom w:type="dxa" w:w="30"/>
-              <w:right w:type="dxa" w:w="70"/>
-            </w:tcMar>
-            <w:vAlign w:val="center"/>
-          </w:tcPr>
-          <w:p>
-            <w:pPr>
-              <w:spacing w:after="0" w:before="0" w:line="240" w:lineRule="auto"/>
-              <w:jc w:val="left"/>
-            </w:pPr>
-          </w:p>
-        </w:tc>
-        <w:tc>
-          <w:tcPr>
-            <w:tcW w:type="dxa" w:w="644"/>
+            <w:tcW w:type="dxa" w:w="1187"/>
+            <w:tcBorders>
+              <w:top w:val="single" w:color="000000" w:sz="4"/>
+              <w:left w:val="single" w:color="000000" w:sz="4"/>
+              <w:bottom w:val="single" w:color="000000" w:sz="4"/>
+              <w:right w:val="single" w:color="000000" w:sz="4"/>
+            </w:tcBorders>
+            <w:tcMar>
+              <w:top w:type="dxa" w:w="30"/>
+              <w:left w:type="dxa" w:w="70"/>
+              <w:bottom w:type="dxa" w:w="30"/>
+              <w:right w:type="dxa" w:w="70"/>
+            </w:tcMar>
+            <w:vAlign w:val="center"/>
+          </w:tcPr>
+          <w:p>
+            <w:pPr>
+              <w:spacing w:after="0" w:before="0" w:line="240" w:lineRule="auto"/>
+              <w:jc w:val="left"/>
+            </w:pPr>
+          </w:p>
+        </w:tc>
+        <w:tc>
+          <w:tcPr>
+            <w:tcW w:type="dxa" w:w="830"/>
             <w:tcBorders>
               <w:top w:val="single" w:color="000000" w:sz="4"/>
               <w:left w:val="single" w:color="000000" w:sz="4"/>
@@ -8291,7 +8291,7 @@
         </w:tc>
         <w:tc>
           <w:tcPr>
-            <w:tcW w:type="dxa" w:w="1715"/>
+            <w:tcW w:type="dxa" w:w="921"/>
             <w:tcBorders>
               <w:top w:val="single" w:color="000000" w:sz="4"/>
               <w:left w:val="single" w:color="000000" w:sz="4"/>
@@ -8321,7 +8321,7 @@
         </w:trPr>
         <w:tc>
           <w:tcPr>
-            <w:tcW w:type="dxa" w:w="3484"/>
+            <w:tcW w:type="dxa" w:w="4314"/>
             <w:tcBorders>
               <w:top w:val="single" w:color="000000" w:sz="4"/>
               <w:left w:val="single" w:color="000000" w:sz="4"/>
@@ -8357,7 +8357,7 @@
         </w:tc>
         <w:tc>
           <w:tcPr>
-            <w:tcW w:type="dxa" w:w="1466"/>
+            <w:tcW w:type="dxa" w:w="1773"/>
             <w:tcBorders>
               <w:top w:val="single" w:color="000000" w:sz="4"/>
               <w:left w:val="single" w:color="000000" w:sz="4"/>
@@ -8394,31 +8394,31 @@
         </w:tc>
         <w:tc>
           <w:tcPr>
-            <w:tcW w:type="dxa" w:w="1716"/>
-            <w:tcBorders>
-              <w:top w:val="single" w:color="000000" w:sz="4"/>
-              <w:left w:val="single" w:color="000000" w:sz="4"/>
-              <w:bottom w:val="single" w:color="000000" w:sz="4"/>
-              <w:right w:val="single" w:color="000000" w:sz="4"/>
-            </w:tcBorders>
-            <w:tcMar>
-              <w:top w:type="dxa" w:w="30"/>
-              <w:left w:type="dxa" w:w="70"/>
-              <w:bottom w:type="dxa" w:w="30"/>
-              <w:right w:type="dxa" w:w="70"/>
-            </w:tcMar>
-            <w:vAlign w:val="center"/>
-          </w:tcPr>
-          <w:p>
-            <w:pPr>
-              <w:spacing w:after="0" w:before="0" w:line="240" w:lineRule="auto"/>
-              <w:jc w:val="left"/>
-            </w:pPr>
-          </w:p>
-        </w:tc>
-        <w:tc>
-          <w:tcPr>
-            <w:tcW w:type="dxa" w:w="644"/>
+            <w:tcW w:type="dxa" w:w="1187"/>
+            <w:tcBorders>
+              <w:top w:val="single" w:color="000000" w:sz="4"/>
+              <w:left w:val="single" w:color="000000" w:sz="4"/>
+              <w:bottom w:val="single" w:color="000000" w:sz="4"/>
+              <w:right w:val="single" w:color="000000" w:sz="4"/>
+            </w:tcBorders>
+            <w:tcMar>
+              <w:top w:type="dxa" w:w="30"/>
+              <w:left w:type="dxa" w:w="70"/>
+              <w:bottom w:type="dxa" w:w="30"/>
+              <w:right w:type="dxa" w:w="70"/>
+            </w:tcMar>
+            <w:vAlign w:val="center"/>
+          </w:tcPr>
+          <w:p>
+            <w:pPr>
+              <w:spacing w:after="0" w:before="0" w:line="240" w:lineRule="auto"/>
+              <w:jc w:val="left"/>
+            </w:pPr>
+          </w:p>
+        </w:tc>
+        <w:tc>
+          <w:tcPr>
+            <w:tcW w:type="dxa" w:w="830"/>
             <w:tcBorders>
               <w:top w:val="single" w:color="000000" w:sz="4"/>
               <w:left w:val="single" w:color="000000" w:sz="4"/>
@@ -8455,7 +8455,7 @@
         </w:tc>
         <w:tc>
           <w:tcPr>
-            <w:tcW w:type="dxa" w:w="1715"/>
+            <w:tcW w:type="dxa" w:w="921"/>
             <w:tcBorders>
               <w:top w:val="single" w:color="000000" w:sz="4"/>
               <w:left w:val="single" w:color="000000" w:sz="4"/>

</xml_diff>